<commit_message>
Add validity check of documents received from supplier
Reviewed the business license, ISO 9001, SGS Gold Plus, RoHS (labelled
CE) certificate and both quotations received on 2026-08-09:

- ISO 9001:2015 expired 2025-09-26; SGS Gold Plus expired 2025-10-14 —
  renewed copies must be requested before any customer submission
- The document supplied as CE is a sample-limited RoHS certificate of
  conformity from a private lab, past the one-year renewal norm
- Both quotations lapsed after their 5-day validity
- Business license is valid indefinitely; recorded credit code, legal
  representative, registered capital and business scope from it

Co-Authored-By: Claude Opus 5 <noreply@anthropic.com>
Claude-Session: https://claude.ai/code/session_01D8V4YsNDSgybhuKSqPBmt4
</commit_message>
<xml_diff>
--- a/docs/shandong-botong/Botong_Supplier_Dossier.docx
+++ b/docs/shandong-botong/Botong_Supplier_Dossier.docx
@@ -557,7 +557,7 @@
                 <w:sz w:val="19"/>
                 <w:szCs w:val="19"/>
               </w:rPr>
-              <w:t xml:space="preserve">Botong 법인 설립</w:t>
+              <w:t xml:space="preserve">통일사회신용코드</w:t>
             </w:r>
           </w:p>
         </w:tc>
@@ -583,7 +583,7 @@
                 <w:sz w:val="19"/>
                 <w:szCs w:val="19"/>
               </w:rPr>
-              <w:t xml:space="preserve">2015년 12월</w:t>
+              <w:t xml:space="preserve">91370832MA3C4K5D8Q</w:t>
             </w:r>
           </w:p>
         </w:tc>
@@ -609,7 +609,7 @@
                 <w:sz w:val="19"/>
                 <w:szCs w:val="19"/>
               </w:rPr>
-              <w:t xml:space="preserve">Alibaba</w:t>
+              <w:t xml:space="preserve">사업자등록증</w:t>
             </w:r>
           </w:p>
         </w:tc>
@@ -637,7 +637,7 @@
                 <w:sz w:val="19"/>
                 <w:szCs w:val="19"/>
               </w:rPr>
-              <w:t xml:space="preserve">임직원</w:t>
+              <w:t xml:space="preserve">법정대표인</w:t>
             </w:r>
           </w:p>
         </w:tc>
@@ -663,7 +663,7 @@
                 <w:sz w:val="19"/>
                 <w:szCs w:val="19"/>
               </w:rPr>
-              <w:t xml:space="preserve">174명 (R&amp;D 엔지니어 8명)</w:t>
+              <w:t xml:space="preserve">艾广远 (Ai Guangyuan)</w:t>
             </w:r>
           </w:p>
         </w:tc>
@@ -689,7 +689,7 @@
                 <w:sz w:val="19"/>
                 <w:szCs w:val="19"/>
               </w:rPr>
-              <w:t xml:space="preserve">Alibaba</w:t>
+              <w:t xml:space="preserve">사업자등록증</w:t>
             </w:r>
           </w:p>
         </w:tc>
@@ -717,7 +717,7 @@
                 <w:sz w:val="19"/>
                 <w:szCs w:val="19"/>
               </w:rPr>
-              <w:t xml:space="preserve">부지/공장</w:t>
+              <w:t xml:space="preserve">등록자본금 (Botong 법인)</w:t>
             </w:r>
           </w:p>
         </w:tc>
@@ -743,7 +743,7 @@
                 <w:sz w:val="19"/>
                 <w:szCs w:val="19"/>
               </w:rPr>
-              <w:t xml:space="preserve">부지 약 80,000㎡ / 차간(공장동) 22,000㎡</w:t>
+              <w:t xml:space="preserve">2,100만元 (홈페이지의 5,000만/7,000만元은 모그룹 수치)</w:t>
             </w:r>
           </w:p>
         </w:tc>
@@ -769,7 +769,7 @@
                 <w:sz w:val="19"/>
                 <w:szCs w:val="19"/>
               </w:rPr>
-              <w:t xml:space="preserve">홈페이지</w:t>
+              <w:t xml:space="preserve">사업자등록증</w:t>
             </w:r>
           </w:p>
         </w:tc>
@@ -797,7 +797,7 @@
                 <w:sz w:val="19"/>
                 <w:szCs w:val="19"/>
               </w:rPr>
-              <w:t xml:space="preserve">설비</w:t>
+              <w:t xml:space="preserve">경영범위</w:t>
             </w:r>
           </w:p>
         </w:tc>
@@ -823,7 +823,7 @@
                 <w:sz w:val="19"/>
                 <w:szCs w:val="19"/>
               </w:rPr>
-              <w:t xml:space="preserve">1,450톤급·2,300톤급 알루미늄 합금 형재 생산라인 2조, 전용 금형 300세트</w:t>
+              <w:t xml:space="preserve">铝型材及制品加工·销售 외 철강 계열 — 냉간인발·무계목관 표기 없음</w:t>
             </w:r>
           </w:p>
         </w:tc>
@@ -849,7 +849,7 @@
                 <w:sz w:val="19"/>
                 <w:szCs w:val="19"/>
               </w:rPr>
-              <w:t xml:space="preserve">홈페이지</w:t>
+              <w:t xml:space="preserve">사업자등록증</w:t>
             </w:r>
           </w:p>
         </w:tc>
@@ -877,7 +877,7 @@
                 <w:sz w:val="19"/>
                 <w:szCs w:val="19"/>
               </w:rPr>
-              <w:t xml:space="preserve">주소</w:t>
+              <w:t xml:space="preserve">Botong 법인 설립</w:t>
             </w:r>
           </w:p>
         </w:tc>
@@ -903,7 +903,7 @@
                 <w:sz w:val="19"/>
                 <w:szCs w:val="19"/>
               </w:rPr>
-              <w:t xml:space="preserve">Dongfeng Road, Middle Section, Liangshan Industrial Park, Liangshan Street, Jining City, Shandong Province</w:t>
+              <w:t xml:space="preserve">2015년 12월 22일</w:t>
             </w:r>
           </w:p>
         </w:tc>
@@ -929,7 +929,7 @@
                 <w:sz w:val="19"/>
                 <w:szCs w:val="19"/>
               </w:rPr>
-              <w:t xml:space="preserve">명함</w:t>
+              <w:t xml:space="preserve">사업자등록증</w:t>
             </w:r>
           </w:p>
         </w:tc>
@@ -957,7 +957,7 @@
                 <w:sz w:val="19"/>
                 <w:szCs w:val="19"/>
               </w:rPr>
-              <w:t xml:space="preserve">담당자</w:t>
+              <w:t xml:space="preserve">임직원</w:t>
             </w:r>
           </w:p>
         </w:tc>
@@ -983,7 +983,7 @@
                 <w:sz w:val="19"/>
                 <w:szCs w:val="19"/>
               </w:rPr>
-              <w:t xml:space="preserve">Lawrence (Fang Guangyuan, 방광원) — Sales Manager</w:t>
+              <w:t xml:space="preserve">174명 (R&amp;D 엔지니어 8명)</w:t>
             </w:r>
           </w:p>
         </w:tc>
@@ -1009,7 +1009,7 @@
                 <w:sz w:val="19"/>
                 <w:szCs w:val="19"/>
               </w:rPr>
-              <w:t xml:space="preserve">명함</w:t>
+              <w:t xml:space="preserve">Alibaba</w:t>
             </w:r>
           </w:p>
         </w:tc>
@@ -1037,7 +1037,7 @@
                 <w:sz w:val="19"/>
                 <w:szCs w:val="19"/>
               </w:rPr>
-              <w:t xml:space="preserve">연락처</w:t>
+              <w:t xml:space="preserve">부지/공장</w:t>
             </w:r>
           </w:p>
         </w:tc>
@@ -1063,7 +1063,7 @@
                 <w:sz w:val="19"/>
                 <w:szCs w:val="19"/>
               </w:rPr>
-              <w:t xml:space="preserve">lawrencefang6@163.com / WhatsApp·WeChat +86 17661971710</w:t>
+              <w:t xml:space="preserve">부지 약 80,000㎡ / 차간(공장동) 22,000㎡</w:t>
             </w:r>
           </w:p>
         </w:tc>
@@ -1089,7 +1089,7 @@
                 <w:sz w:val="19"/>
                 <w:szCs w:val="19"/>
               </w:rPr>
-              <w:t xml:space="preserve">명함</w:t>
+              <w:t xml:space="preserve">홈페이지</w:t>
             </w:r>
           </w:p>
         </w:tc>
@@ -1117,7 +1117,7 @@
                 <w:sz w:val="19"/>
                 <w:szCs w:val="19"/>
               </w:rPr>
-              <w:t xml:space="preserve">웹사이트</w:t>
+              <w:t xml:space="preserve">설비</w:t>
             </w:r>
           </w:p>
         </w:tc>
@@ -1143,7 +1143,7 @@
                 <w:sz w:val="19"/>
                 <w:szCs w:val="19"/>
               </w:rPr>
-              <w:t xml:space="preserve">www.yuantongjituan.cn / sdbtly.en.alibaba.com</w:t>
+              <w:t xml:space="preserve">1,450톤급·2,300톤급 알루미늄 합금 형재 생산라인 2조, 전용 금형 300세트</w:t>
             </w:r>
           </w:p>
         </w:tc>
@@ -1169,7 +1169,7 @@
                 <w:sz w:val="19"/>
                 <w:szCs w:val="19"/>
               </w:rPr>
-              <w:t xml:space="preserve">명함</w:t>
+              <w:t xml:space="preserve">홈페이지</w:t>
             </w:r>
           </w:p>
         </w:tc>
@@ -1197,7 +1197,7 @@
                 <w:sz w:val="19"/>
                 <w:szCs w:val="19"/>
               </w:rPr>
-              <w:t xml:space="preserve">보유 인증(자칭)</w:t>
+              <w:t xml:space="preserve">주소</w:t>
             </w:r>
           </w:p>
         </w:tc>
@@ -1223,7 +1223,7 @@
                 <w:sz w:val="19"/>
                 <w:szCs w:val="19"/>
               </w:rPr>
-              <w:t xml:space="preserve">ISO 9001:2015, CE, Alibaba Gold Plus SGS, 수출품 품질허가증</w:t>
+              <w:t xml:space="preserve">Dongfeng Road, Middle Section, Liangshan Industrial Park, Liangshan Street, Jining City, Shandong Province</w:t>
             </w:r>
           </w:p>
         </w:tc>
@@ -1249,7 +1249,327 @@
                 <w:sz w:val="19"/>
                 <w:szCs w:val="19"/>
               </w:rPr>
-              <w:t xml:space="preserve">견적서·Alibaba·홈페이지</w:t>
+              <w:t xml:space="preserve">명함</w:t>
+            </w:r>
+          </w:p>
+        </w:tc>
+      </w:tr>
+      <w:tr>
+        <w:tc>
+          <w:tcPr>
+            <w:tcW w:type="dxa" w:w="2100"/>
+            <w:tcMar>
+              <w:top w:type="dxa" w:w="60"/>
+              <w:left w:type="dxa" w:w="100"/>
+              <w:bottom w:type="dxa" w:w="60"/>
+              <w:right w:type="dxa" w:w="100"/>
+            </w:tcMar>
+            <w:vAlign w:val="center"/>
+          </w:tcPr>
+          <w:p>
+            <w:pPr>
+              <w:spacing w:after="0"/>
+            </w:pPr>
+            <w:r>
+              <w:rPr>
+                <w:b w:val="false"/>
+                <w:bCs w:val="false"/>
+                <w:sz w:val="19"/>
+                <w:szCs w:val="19"/>
+              </w:rPr>
+              <w:t xml:space="preserve">담당자</w:t>
+            </w:r>
+          </w:p>
+        </w:tc>
+        <w:tc>
+          <w:tcPr>
+            <w:tcW w:type="dxa" w:w="5500"/>
+            <w:tcMar>
+              <w:top w:type="dxa" w:w="60"/>
+              <w:left w:type="dxa" w:w="100"/>
+              <w:bottom w:type="dxa" w:w="60"/>
+              <w:right w:type="dxa" w:w="100"/>
+            </w:tcMar>
+            <w:vAlign w:val="center"/>
+          </w:tcPr>
+          <w:p>
+            <w:pPr>
+              <w:spacing w:after="0"/>
+            </w:pPr>
+            <w:r>
+              <w:rPr>
+                <w:b w:val="false"/>
+                <w:bCs w:val="false"/>
+                <w:sz w:val="19"/>
+                <w:szCs w:val="19"/>
+              </w:rPr>
+              <w:t xml:space="preserve">Lawrence (Fang Guangyuan, 방광원) — Sales Manager</w:t>
+            </w:r>
+          </w:p>
+        </w:tc>
+        <w:tc>
+          <w:tcPr>
+            <w:tcW w:type="dxa" w:w="1706"/>
+            <w:tcMar>
+              <w:top w:type="dxa" w:w="60"/>
+              <w:left w:type="dxa" w:w="100"/>
+              <w:bottom w:type="dxa" w:w="60"/>
+              <w:right w:type="dxa" w:w="100"/>
+            </w:tcMar>
+            <w:vAlign w:val="center"/>
+          </w:tcPr>
+          <w:p>
+            <w:pPr>
+              <w:spacing w:after="0"/>
+            </w:pPr>
+            <w:r>
+              <w:rPr>
+                <w:b w:val="false"/>
+                <w:bCs w:val="false"/>
+                <w:sz w:val="19"/>
+                <w:szCs w:val="19"/>
+              </w:rPr>
+              <w:t xml:space="preserve">명함</w:t>
+            </w:r>
+          </w:p>
+        </w:tc>
+      </w:tr>
+      <w:tr>
+        <w:tc>
+          <w:tcPr>
+            <w:tcW w:type="dxa" w:w="2100"/>
+            <w:tcMar>
+              <w:top w:type="dxa" w:w="60"/>
+              <w:left w:type="dxa" w:w="100"/>
+              <w:bottom w:type="dxa" w:w="60"/>
+              <w:right w:type="dxa" w:w="100"/>
+            </w:tcMar>
+            <w:vAlign w:val="center"/>
+          </w:tcPr>
+          <w:p>
+            <w:pPr>
+              <w:spacing w:after="0"/>
+            </w:pPr>
+            <w:r>
+              <w:rPr>
+                <w:b w:val="false"/>
+                <w:bCs w:val="false"/>
+                <w:sz w:val="19"/>
+                <w:szCs w:val="19"/>
+              </w:rPr>
+              <w:t xml:space="preserve">연락처</w:t>
+            </w:r>
+          </w:p>
+        </w:tc>
+        <w:tc>
+          <w:tcPr>
+            <w:tcW w:type="dxa" w:w="5500"/>
+            <w:tcMar>
+              <w:top w:type="dxa" w:w="60"/>
+              <w:left w:type="dxa" w:w="100"/>
+              <w:bottom w:type="dxa" w:w="60"/>
+              <w:right w:type="dxa" w:w="100"/>
+            </w:tcMar>
+            <w:vAlign w:val="center"/>
+          </w:tcPr>
+          <w:p>
+            <w:pPr>
+              <w:spacing w:after="0"/>
+            </w:pPr>
+            <w:r>
+              <w:rPr>
+                <w:b w:val="false"/>
+                <w:bCs w:val="false"/>
+                <w:sz w:val="19"/>
+                <w:szCs w:val="19"/>
+              </w:rPr>
+              <w:t xml:space="preserve">lawrencefang6@163.com / WhatsApp·WeChat +86 17661971710</w:t>
+            </w:r>
+          </w:p>
+        </w:tc>
+        <w:tc>
+          <w:tcPr>
+            <w:tcW w:type="dxa" w:w="1706"/>
+            <w:tcMar>
+              <w:top w:type="dxa" w:w="60"/>
+              <w:left w:type="dxa" w:w="100"/>
+              <w:bottom w:type="dxa" w:w="60"/>
+              <w:right w:type="dxa" w:w="100"/>
+            </w:tcMar>
+            <w:vAlign w:val="center"/>
+          </w:tcPr>
+          <w:p>
+            <w:pPr>
+              <w:spacing w:after="0"/>
+            </w:pPr>
+            <w:r>
+              <w:rPr>
+                <w:b w:val="false"/>
+                <w:bCs w:val="false"/>
+                <w:sz w:val="19"/>
+                <w:szCs w:val="19"/>
+              </w:rPr>
+              <w:t xml:space="preserve">명함</w:t>
+            </w:r>
+          </w:p>
+        </w:tc>
+      </w:tr>
+      <w:tr>
+        <w:tc>
+          <w:tcPr>
+            <w:tcW w:type="dxa" w:w="2100"/>
+            <w:tcMar>
+              <w:top w:type="dxa" w:w="60"/>
+              <w:left w:type="dxa" w:w="100"/>
+              <w:bottom w:type="dxa" w:w="60"/>
+              <w:right w:type="dxa" w:w="100"/>
+            </w:tcMar>
+            <w:vAlign w:val="center"/>
+          </w:tcPr>
+          <w:p>
+            <w:pPr>
+              <w:spacing w:after="0"/>
+            </w:pPr>
+            <w:r>
+              <w:rPr>
+                <w:b w:val="false"/>
+                <w:bCs w:val="false"/>
+                <w:sz w:val="19"/>
+                <w:szCs w:val="19"/>
+              </w:rPr>
+              <w:t xml:space="preserve">웹사이트</w:t>
+            </w:r>
+          </w:p>
+        </w:tc>
+        <w:tc>
+          <w:tcPr>
+            <w:tcW w:type="dxa" w:w="5500"/>
+            <w:tcMar>
+              <w:top w:type="dxa" w:w="60"/>
+              <w:left w:type="dxa" w:w="100"/>
+              <w:bottom w:type="dxa" w:w="60"/>
+              <w:right w:type="dxa" w:w="100"/>
+            </w:tcMar>
+            <w:vAlign w:val="center"/>
+          </w:tcPr>
+          <w:p>
+            <w:pPr>
+              <w:spacing w:after="0"/>
+            </w:pPr>
+            <w:r>
+              <w:rPr>
+                <w:b w:val="false"/>
+                <w:bCs w:val="false"/>
+                <w:sz w:val="19"/>
+                <w:szCs w:val="19"/>
+              </w:rPr>
+              <w:t xml:space="preserve">www.yuantongjituan.cn / sdbtly.en.alibaba.com</w:t>
+            </w:r>
+          </w:p>
+        </w:tc>
+        <w:tc>
+          <w:tcPr>
+            <w:tcW w:type="dxa" w:w="1706"/>
+            <w:tcMar>
+              <w:top w:type="dxa" w:w="60"/>
+              <w:left w:type="dxa" w:w="100"/>
+              <w:bottom w:type="dxa" w:w="60"/>
+              <w:right w:type="dxa" w:w="100"/>
+            </w:tcMar>
+            <w:vAlign w:val="center"/>
+          </w:tcPr>
+          <w:p>
+            <w:pPr>
+              <w:spacing w:after="0"/>
+            </w:pPr>
+            <w:r>
+              <w:rPr>
+                <w:b w:val="false"/>
+                <w:bCs w:val="false"/>
+                <w:sz w:val="19"/>
+                <w:szCs w:val="19"/>
+              </w:rPr>
+              <w:t xml:space="preserve">명함</w:t>
+            </w:r>
+          </w:p>
+        </w:tc>
+      </w:tr>
+      <w:tr>
+        <w:tc>
+          <w:tcPr>
+            <w:tcW w:type="dxa" w:w="2100"/>
+            <w:tcMar>
+              <w:top w:type="dxa" w:w="60"/>
+              <w:left w:type="dxa" w:w="100"/>
+              <w:bottom w:type="dxa" w:w="60"/>
+              <w:right w:type="dxa" w:w="100"/>
+            </w:tcMar>
+            <w:vAlign w:val="center"/>
+          </w:tcPr>
+          <w:p>
+            <w:pPr>
+              <w:spacing w:after="0"/>
+            </w:pPr>
+            <w:r>
+              <w:rPr>
+                <w:b w:val="false"/>
+                <w:bCs w:val="false"/>
+                <w:sz w:val="19"/>
+                <w:szCs w:val="19"/>
+              </w:rPr>
+              <w:t xml:space="preserve">보유 인증</w:t>
+            </w:r>
+          </w:p>
+        </w:tc>
+        <w:tc>
+          <w:tcPr>
+            <w:tcW w:type="dxa" w:w="5500"/>
+            <w:tcMar>
+              <w:top w:type="dxa" w:w="60"/>
+              <w:left w:type="dxa" w:w="100"/>
+              <w:bottom w:type="dxa" w:w="60"/>
+              <w:right w:type="dxa" w:w="100"/>
+            </w:tcMar>
+            <w:vAlign w:val="center"/>
+          </w:tcPr>
+          <w:p>
+            <w:pPr>
+              <w:spacing w:after="0"/>
+            </w:pPr>
+            <w:r>
+              <w:rPr>
+                <w:b w:val="false"/>
+                <w:bCs w:val="false"/>
+                <w:sz w:val="19"/>
+                <w:szCs w:val="19"/>
+              </w:rPr>
+              <w:t xml:space="preserve">ISO 9001:2015 (2025-09-26 만료), SGS Gold Plus (2025-10-14 만료), CE명 RoHS 증서 — 5항 참조</w:t>
+            </w:r>
+          </w:p>
+        </w:tc>
+        <w:tc>
+          <w:tcPr>
+            <w:tcW w:type="dxa" w:w="1706"/>
+            <w:tcMar>
+              <w:top w:type="dxa" w:w="60"/>
+              <w:left w:type="dxa" w:w="100"/>
+              <w:bottom w:type="dxa" w:w="60"/>
+              <w:right w:type="dxa" w:w="100"/>
+            </w:tcMar>
+            <w:vAlign w:val="center"/>
+          </w:tcPr>
+          <w:p>
+            <w:pPr>
+              <w:spacing w:after="0"/>
+            </w:pPr>
+            <w:r>
+              <w:rPr>
+                <w:b w:val="false"/>
+                <w:bCs w:val="false"/>
+                <w:sz w:val="19"/>
+                <w:szCs w:val="19"/>
+              </w:rPr>
+              <w:t xml:space="preserve">수령 증서 실물</w:t>
             </w:r>
           </w:p>
         </w:tc>
@@ -1694,6 +2014,60 @@
                 <w:szCs w:val="19"/>
               </w:rPr>
               <w:t xml:space="preserve">구매 요구사항 문서(국/영문) 작성 — 협의용</w:t>
+            </w:r>
+          </w:p>
+        </w:tc>
+      </w:tr>
+      <w:tr>
+        <w:tc>
+          <w:tcPr>
+            <w:tcW w:type="dxa" w:w="1700"/>
+            <w:tcMar>
+              <w:top w:type="dxa" w:w="60"/>
+              <w:left w:type="dxa" w:w="100"/>
+              <w:bottom w:type="dxa" w:w="60"/>
+              <w:right w:type="dxa" w:w="100"/>
+            </w:tcMar>
+            <w:vAlign w:val="center"/>
+          </w:tcPr>
+          <w:p>
+            <w:pPr>
+              <w:spacing w:after="0"/>
+            </w:pPr>
+            <w:r>
+              <w:rPr>
+                <w:b w:val="false"/>
+                <w:bCs w:val="false"/>
+                <w:sz w:val="19"/>
+                <w:szCs w:val="19"/>
+              </w:rPr>
+              <w:t xml:space="preserve">2026-08-09</w:t>
+            </w:r>
+          </w:p>
+        </w:tc>
+        <w:tc>
+          <w:tcPr>
+            <w:tcW w:type="dxa" w:w="7606"/>
+            <w:tcMar>
+              <w:top w:type="dxa" w:w="60"/>
+              <w:left w:type="dxa" w:w="100"/>
+              <w:bottom w:type="dxa" w:w="60"/>
+              <w:right w:type="dxa" w:w="100"/>
+            </w:tcMar>
+            <w:vAlign w:val="center"/>
+          </w:tcPr>
+          <w:p>
+            <w:pPr>
+              <w:spacing w:after="0"/>
+            </w:pPr>
+            <w:r>
+              <w:rPr>
+                <w:b w:val="false"/>
+                <w:bCs w:val="false"/>
+                <w:sz w:val="19"/>
+                <w:szCs w:val="19"/>
+              </w:rPr>
+              <w:t xml:space="preserve">Lawrence로부터 자료 수령 — 사업자등록증, ISO 9001, SGS Gold Plus, CE(RoHS) 증서, 견적서 2건, 박사후 실천기지 현판 사진 (유효성 점검 결과 5항 참조)</w:t>
             </w:r>
           </w:p>
         </w:tc>
@@ -5415,9 +5789,926 @@
           <w:sz w:val="26"/>
           <w:szCs w:val="26"/>
         </w:rPr>
-        <w:t xml:space="preserve">5. 제이에스텍 / 제이에스엠텍 제출 대비 — Botong 요청 서류 체크리스트</w:t>
-      </w:r>
-    </w:p>
+        <w:t xml:space="preserve">5. 수령 자료 유효성 점검 (2026-08-09 기준)</w:t>
+      </w:r>
+    </w:p>
+    <w:p>
+      <w:pPr>
+        <w:pBdr>
+          <w:top w:val="single" w:color="B03030" w:sz="4"/>
+          <w:left w:val="single" w:color="B03030" w:sz="24"/>
+        </w:pBdr>
+        <w:shd w:fill="FDECEA" w:val="clear"/>
+        <w:spacing w:after="50" w:before="120"/>
+        <w:ind w:left="200" w:right="200"/>
+      </w:pPr>
+      <w:r>
+        <w:rPr>
+          <w:b/>
+          <w:bCs/>
+          <w:color w:val="3A2020"/>
+          <w:sz w:val="20"/>
+          <w:szCs w:val="20"/>
+        </w:rPr>
+        <w:t xml:space="preserve">인증서 2건이 이미 만료 — 현재 상태로는 제이에스텍/제이에스엠텍 제출 불가.</w:t>
+      </w:r>
+    </w:p>
+    <w:p>
+      <w:pPr>
+        <w:pBdr>
+          <w:bottom w:val="single" w:color="B03030" w:sz="4"/>
+          <w:left w:val="single" w:color="B03030" w:sz="24"/>
+        </w:pBdr>
+        <w:shd w:fill="FDECEA" w:val="clear"/>
+        <w:spacing w:after="160" w:before="0"/>
+        <w:ind w:left="200" w:right="200"/>
+      </w:pPr>
+      <w:r>
+        <w:rPr>
+          <w:b w:val="false"/>
+          <w:bCs w:val="false"/>
+          <w:color w:val="3A2020"/>
+          <w:sz w:val="20"/>
+          <w:szCs w:val="20"/>
+        </w:rPr>
+        <w:t xml:space="preserve">ISO 9001:2015 → 2025-09-26 만료 (317일 경과) / SGS Gold Plus → 2025-10-14 만료 (299일 경과). 갱신본 요청 필수.</w:t>
+      </w:r>
+    </w:p>
+    <w:tbl>
+      <w:tblPr>
+        <w:tblW w:type="dxa" w:w="9306"/>
+        <w:tblBorders>
+          <w:top w:val="single" w:color="auto" w:sz="4"/>
+          <w:left w:val="single" w:color="auto" w:sz="4"/>
+          <w:bottom w:val="single" w:color="auto" w:sz="4"/>
+          <w:right w:val="single" w:color="auto" w:sz="4"/>
+          <w:insideH w:val="single" w:color="auto" w:sz="4"/>
+          <w:insideV w:val="single" w:color="auto" w:sz="4"/>
+        </w:tblBorders>
+      </w:tblPr>
+      <w:tblGrid>
+        <w:gridCol w:w="2600"/>
+        <w:gridCol w:w="2000"/>
+        <w:gridCol w:w="1600"/>
+        <w:gridCol w:w="3106"/>
+      </w:tblGrid>
+      <w:tr>
+        <w:tc>
+          <w:tcPr>
+            <w:tcW w:type="dxa" w:w="2600"/>
+            <w:shd w:fill="E4EEF1" w:val="clear"/>
+            <w:tcMar>
+              <w:top w:type="dxa" w:w="60"/>
+              <w:left w:type="dxa" w:w="100"/>
+              <w:bottom w:type="dxa" w:w="60"/>
+              <w:right w:type="dxa" w:w="100"/>
+            </w:tcMar>
+            <w:vAlign w:val="center"/>
+          </w:tcPr>
+          <w:p>
+            <w:pPr>
+              <w:spacing w:after="0"/>
+            </w:pPr>
+            <w:r>
+              <w:rPr>
+                <w:b/>
+                <w:bCs/>
+                <w:color w:val="2E5878"/>
+                <w:sz w:val="19"/>
+                <w:szCs w:val="19"/>
+              </w:rPr>
+              <w:t xml:space="preserve">자료</w:t>
+            </w:r>
+          </w:p>
+        </w:tc>
+        <w:tc>
+          <w:tcPr>
+            <w:tcW w:type="dxa" w:w="2000"/>
+            <w:shd w:fill="E4EEF1" w:val="clear"/>
+            <w:tcMar>
+              <w:top w:type="dxa" w:w="60"/>
+              <w:left w:type="dxa" w:w="100"/>
+              <w:bottom w:type="dxa" w:w="60"/>
+              <w:right w:type="dxa" w:w="100"/>
+            </w:tcMar>
+            <w:vAlign w:val="center"/>
+          </w:tcPr>
+          <w:p>
+            <w:pPr>
+              <w:spacing w:after="0"/>
+            </w:pPr>
+            <w:r>
+              <w:rPr>
+                <w:b/>
+                <w:bCs/>
+                <w:color w:val="2E5878"/>
+                <w:sz w:val="19"/>
+                <w:szCs w:val="19"/>
+              </w:rPr>
+              <w:t xml:space="preserve">번호</w:t>
+            </w:r>
+          </w:p>
+        </w:tc>
+        <w:tc>
+          <w:tcPr>
+            <w:tcW w:type="dxa" w:w="1600"/>
+            <w:shd w:fill="E4EEF1" w:val="clear"/>
+            <w:tcMar>
+              <w:top w:type="dxa" w:w="60"/>
+              <w:left w:type="dxa" w:w="100"/>
+              <w:bottom w:type="dxa" w:w="60"/>
+              <w:right w:type="dxa" w:w="100"/>
+            </w:tcMar>
+            <w:vAlign w:val="center"/>
+          </w:tcPr>
+          <w:p>
+            <w:pPr>
+              <w:spacing w:after="0"/>
+            </w:pPr>
+            <w:r>
+              <w:rPr>
+                <w:b/>
+                <w:bCs/>
+                <w:color w:val="2E5878"/>
+                <w:sz w:val="19"/>
+                <w:szCs w:val="19"/>
+              </w:rPr>
+              <w:t xml:space="preserve">만료일</w:t>
+            </w:r>
+          </w:p>
+        </w:tc>
+        <w:tc>
+          <w:tcPr>
+            <w:tcW w:type="dxa" w:w="3106"/>
+            <w:shd w:fill="E4EEF1" w:val="clear"/>
+            <w:tcMar>
+              <w:top w:type="dxa" w:w="60"/>
+              <w:left w:type="dxa" w:w="100"/>
+              <w:bottom w:type="dxa" w:w="60"/>
+              <w:right w:type="dxa" w:w="100"/>
+            </w:tcMar>
+            <w:vAlign w:val="center"/>
+          </w:tcPr>
+          <w:p>
+            <w:pPr>
+              <w:spacing w:after="0"/>
+            </w:pPr>
+            <w:r>
+              <w:rPr>
+                <w:b/>
+                <w:bCs/>
+                <w:color w:val="2E5878"/>
+                <w:sz w:val="19"/>
+                <w:szCs w:val="19"/>
+              </w:rPr>
+              <w:t xml:space="preserve">판정</w:t>
+            </w:r>
+          </w:p>
+        </w:tc>
+      </w:tr>
+      <w:tr>
+        <w:tc>
+          <w:tcPr>
+            <w:tcW w:type="dxa" w:w="2600"/>
+            <w:tcMar>
+              <w:top w:type="dxa" w:w="60"/>
+              <w:left w:type="dxa" w:w="100"/>
+              <w:bottom w:type="dxa" w:w="60"/>
+              <w:right w:type="dxa" w:w="100"/>
+            </w:tcMar>
+            <w:vAlign w:val="center"/>
+          </w:tcPr>
+          <w:p>
+            <w:pPr>
+              <w:spacing w:after="0"/>
+            </w:pPr>
+            <w:r>
+              <w:rPr>
+                <w:b w:val="false"/>
+                <w:bCs w:val="false"/>
+                <w:sz w:val="19"/>
+                <w:szCs w:val="19"/>
+              </w:rPr>
+              <w:t xml:space="preserve">ISO 9001:2015 인증서</w:t>
+            </w:r>
+          </w:p>
+        </w:tc>
+        <w:tc>
+          <w:tcPr>
+            <w:tcW w:type="dxa" w:w="2000"/>
+            <w:tcMar>
+              <w:top w:type="dxa" w:w="60"/>
+              <w:left w:type="dxa" w:w="100"/>
+              <w:bottom w:type="dxa" w:w="60"/>
+              <w:right w:type="dxa" w:w="100"/>
+            </w:tcMar>
+            <w:vAlign w:val="center"/>
+          </w:tcPr>
+          <w:p>
+            <w:pPr>
+              <w:spacing w:after="0"/>
+            </w:pPr>
+            <w:r>
+              <w:rPr>
+                <w:b w:val="false"/>
+                <w:bCs w:val="false"/>
+                <w:sz w:val="19"/>
+                <w:szCs w:val="19"/>
+              </w:rPr>
+              <w:t xml:space="preserve">66522Q0216R0S</w:t>
+            </w:r>
+          </w:p>
+        </w:tc>
+        <w:tc>
+          <w:tcPr>
+            <w:tcW w:type="dxa" w:w="1600"/>
+            <w:tcMar>
+              <w:top w:type="dxa" w:w="60"/>
+              <w:left w:type="dxa" w:w="100"/>
+              <w:bottom w:type="dxa" w:w="60"/>
+              <w:right w:type="dxa" w:w="100"/>
+            </w:tcMar>
+            <w:vAlign w:val="center"/>
+          </w:tcPr>
+          <w:p>
+            <w:pPr>
+              <w:spacing w:after="0"/>
+            </w:pPr>
+            <w:r>
+              <w:rPr>
+                <w:b w:val="false"/>
+                <w:bCs w:val="false"/>
+                <w:sz w:val="19"/>
+                <w:szCs w:val="19"/>
+              </w:rPr>
+              <w:t xml:space="preserve">2025-09-26</w:t>
+            </w:r>
+          </w:p>
+        </w:tc>
+        <w:tc>
+          <w:tcPr>
+            <w:tcW w:type="dxa" w:w="3106"/>
+            <w:tcMar>
+              <w:top w:type="dxa" w:w="60"/>
+              <w:left w:type="dxa" w:w="100"/>
+              <w:bottom w:type="dxa" w:w="60"/>
+              <w:right w:type="dxa" w:w="100"/>
+            </w:tcMar>
+            <w:vAlign w:val="center"/>
+          </w:tcPr>
+          <w:p>
+            <w:pPr>
+              <w:spacing w:after="0"/>
+            </w:pPr>
+            <w:r>
+              <w:rPr>
+                <w:b w:val="false"/>
+                <w:bCs w:val="false"/>
+                <w:sz w:val="19"/>
+                <w:szCs w:val="19"/>
+              </w:rPr>
+              <w:t xml:space="preserve">만료 (317일 경과) — 갱신본 요청</w:t>
+            </w:r>
+          </w:p>
+        </w:tc>
+      </w:tr>
+      <w:tr>
+        <w:tc>
+          <w:tcPr>
+            <w:tcW w:type="dxa" w:w="2600"/>
+            <w:tcMar>
+              <w:top w:type="dxa" w:w="60"/>
+              <w:left w:type="dxa" w:w="100"/>
+              <w:bottom w:type="dxa" w:w="60"/>
+              <w:right w:type="dxa" w:w="100"/>
+            </w:tcMar>
+            <w:vAlign w:val="center"/>
+          </w:tcPr>
+          <w:p>
+            <w:pPr>
+              <w:spacing w:after="0"/>
+            </w:pPr>
+            <w:r>
+              <w:rPr>
+                <w:b w:val="false"/>
+                <w:bCs w:val="false"/>
+                <w:sz w:val="19"/>
+                <w:szCs w:val="19"/>
+              </w:rPr>
+              <w:t xml:space="preserve">SGS Gold Plus 심사증서</w:t>
+            </w:r>
+          </w:p>
+        </w:tc>
+        <w:tc>
+          <w:tcPr>
+            <w:tcW w:type="dxa" w:w="2000"/>
+            <w:tcMar>
+              <w:top w:type="dxa" w:w="60"/>
+              <w:left w:type="dxa" w:w="100"/>
+              <w:bottom w:type="dxa" w:w="60"/>
+              <w:right w:type="dxa" w:w="100"/>
+            </w:tcMar>
+            <w:vAlign w:val="center"/>
+          </w:tcPr>
+          <w:p>
+            <w:pPr>
+              <w:spacing w:after="0"/>
+            </w:pPr>
+            <w:r>
+              <w:rPr>
+                <w:b w:val="false"/>
+                <w:bCs w:val="false"/>
+                <w:sz w:val="19"/>
+                <w:szCs w:val="19"/>
+              </w:rPr>
+              <w:t xml:space="preserve">164763217_P+T</w:t>
+            </w:r>
+          </w:p>
+        </w:tc>
+        <w:tc>
+          <w:tcPr>
+            <w:tcW w:type="dxa" w:w="1600"/>
+            <w:tcMar>
+              <w:top w:type="dxa" w:w="60"/>
+              <w:left w:type="dxa" w:w="100"/>
+              <w:bottom w:type="dxa" w:w="60"/>
+              <w:right w:type="dxa" w:w="100"/>
+            </w:tcMar>
+            <w:vAlign w:val="center"/>
+          </w:tcPr>
+          <w:p>
+            <w:pPr>
+              <w:spacing w:after="0"/>
+            </w:pPr>
+            <w:r>
+              <w:rPr>
+                <w:b w:val="false"/>
+                <w:bCs w:val="false"/>
+                <w:sz w:val="19"/>
+                <w:szCs w:val="19"/>
+              </w:rPr>
+              <w:t xml:space="preserve">2025-10-14</w:t>
+            </w:r>
+          </w:p>
+        </w:tc>
+        <w:tc>
+          <w:tcPr>
+            <w:tcW w:type="dxa" w:w="3106"/>
+            <w:tcMar>
+              <w:top w:type="dxa" w:w="60"/>
+              <w:left w:type="dxa" w:w="100"/>
+              <w:bottom w:type="dxa" w:w="60"/>
+              <w:right w:type="dxa" w:w="100"/>
+            </w:tcMar>
+            <w:vAlign w:val="center"/>
+          </w:tcPr>
+          <w:p>
+            <w:pPr>
+              <w:spacing w:after="0"/>
+            </w:pPr>
+            <w:r>
+              <w:rPr>
+                <w:b w:val="false"/>
+                <w:bCs w:val="false"/>
+                <w:sz w:val="19"/>
+                <w:szCs w:val="19"/>
+              </w:rPr>
+              <w:t xml:space="preserve">만료 (299일 경과) — 재심사본 요청</w:t>
+            </w:r>
+          </w:p>
+        </w:tc>
+      </w:tr>
+      <w:tr>
+        <w:tc>
+          <w:tcPr>
+            <w:tcW w:type="dxa" w:w="2600"/>
+            <w:tcMar>
+              <w:top w:type="dxa" w:w="60"/>
+              <w:left w:type="dxa" w:w="100"/>
+              <w:bottom w:type="dxa" w:w="60"/>
+              <w:right w:type="dxa" w:w="100"/>
+            </w:tcMar>
+            <w:vAlign w:val="center"/>
+          </w:tcPr>
+          <w:p>
+            <w:pPr>
+              <w:spacing w:after="0"/>
+            </w:pPr>
+            <w:r>
+              <w:rPr>
+                <w:b w:val="false"/>
+                <w:bCs w:val="false"/>
+                <w:sz w:val="19"/>
+                <w:szCs w:val="19"/>
+              </w:rPr>
+              <w:t xml:space="preserve">사업자등록증 (营业执照)</w:t>
+            </w:r>
+          </w:p>
+        </w:tc>
+        <w:tc>
+          <w:tcPr>
+            <w:tcW w:type="dxa" w:w="2000"/>
+            <w:tcMar>
+              <w:top w:type="dxa" w:w="60"/>
+              <w:left w:type="dxa" w:w="100"/>
+              <w:bottom w:type="dxa" w:w="60"/>
+              <w:right w:type="dxa" w:w="100"/>
+            </w:tcMar>
+            <w:vAlign w:val="center"/>
+          </w:tcPr>
+          <w:p>
+            <w:pPr>
+              <w:spacing w:after="0"/>
+            </w:pPr>
+            <w:r>
+              <w:rPr>
+                <w:b w:val="false"/>
+                <w:bCs w:val="false"/>
+                <w:sz w:val="19"/>
+                <w:szCs w:val="19"/>
+              </w:rPr>
+              <w:t xml:space="preserve">91370832MA3C4K5D8Q</w:t>
+            </w:r>
+          </w:p>
+        </w:tc>
+        <w:tc>
+          <w:tcPr>
+            <w:tcW w:type="dxa" w:w="1600"/>
+            <w:tcMar>
+              <w:top w:type="dxa" w:w="60"/>
+              <w:left w:type="dxa" w:w="100"/>
+              <w:bottom w:type="dxa" w:w="60"/>
+              <w:right w:type="dxa" w:w="100"/>
+            </w:tcMar>
+            <w:vAlign w:val="center"/>
+          </w:tcPr>
+          <w:p>
+            <w:pPr>
+              <w:spacing w:after="0"/>
+            </w:pPr>
+            <w:r>
+              <w:rPr>
+                <w:b w:val="false"/>
+                <w:bCs w:val="false"/>
+                <w:sz w:val="19"/>
+                <w:szCs w:val="19"/>
+              </w:rPr>
+              <w:t xml:space="preserve">만료일 공란</w:t>
+            </w:r>
+          </w:p>
+        </w:tc>
+        <w:tc>
+          <w:tcPr>
+            <w:tcW w:type="dxa" w:w="3106"/>
+            <w:tcMar>
+              <w:top w:type="dxa" w:w="60"/>
+              <w:left w:type="dxa" w:w="100"/>
+              <w:bottom w:type="dxa" w:w="60"/>
+              <w:right w:type="dxa" w:w="100"/>
+            </w:tcMar>
+            <w:vAlign w:val="center"/>
+          </w:tcPr>
+          <w:p>
+            <w:pPr>
+              <w:spacing w:after="0"/>
+            </w:pPr>
+            <w:r>
+              <w:rPr>
+                <w:b w:val="false"/>
+                <w:bCs w:val="false"/>
+                <w:sz w:val="19"/>
+                <w:szCs w:val="19"/>
+              </w:rPr>
+              <w:t xml:space="preserve">유효 (무기한)</w:t>
+            </w:r>
+          </w:p>
+        </w:tc>
+      </w:tr>
+      <w:tr>
+        <w:tc>
+          <w:tcPr>
+            <w:tcW w:type="dxa" w:w="2600"/>
+            <w:tcMar>
+              <w:top w:type="dxa" w:w="60"/>
+              <w:left w:type="dxa" w:w="100"/>
+              <w:bottom w:type="dxa" w:w="60"/>
+              <w:right w:type="dxa" w:w="100"/>
+            </w:tcMar>
+            <w:vAlign w:val="center"/>
+          </w:tcPr>
+          <w:p>
+            <w:pPr>
+              <w:spacing w:after="0"/>
+            </w:pPr>
+            <w:r>
+              <w:rPr>
+                <w:b w:val="false"/>
+                <w:bCs w:val="false"/>
+                <w:sz w:val="19"/>
+                <w:szCs w:val="19"/>
+              </w:rPr>
+              <w:t xml:space="preserve">CE (RoHS 적합성 증서)</w:t>
+            </w:r>
+          </w:p>
+        </w:tc>
+        <w:tc>
+          <w:tcPr>
+            <w:tcW w:type="dxa" w:w="2000"/>
+            <w:tcMar>
+              <w:top w:type="dxa" w:w="60"/>
+              <w:left w:type="dxa" w:w="100"/>
+              <w:bottom w:type="dxa" w:w="60"/>
+              <w:right w:type="dxa" w:w="100"/>
+            </w:tcMar>
+            <w:vAlign w:val="center"/>
+          </w:tcPr>
+          <w:p>
+            <w:pPr>
+              <w:spacing w:after="0"/>
+            </w:pPr>
+            <w:r>
+              <w:rPr>
+                <w:b w:val="false"/>
+                <w:bCs w:val="false"/>
+                <w:sz w:val="19"/>
+                <w:szCs w:val="19"/>
+              </w:rPr>
+              <w:t xml:space="preserve">CKEYS241209039</w:t>
+            </w:r>
+          </w:p>
+        </w:tc>
+        <w:tc>
+          <w:tcPr>
+            <w:tcW w:type="dxa" w:w="1600"/>
+            <w:tcMar>
+              <w:top w:type="dxa" w:w="60"/>
+              <w:left w:type="dxa" w:w="100"/>
+              <w:bottom w:type="dxa" w:w="60"/>
+              <w:right w:type="dxa" w:w="100"/>
+            </w:tcMar>
+            <w:vAlign w:val="center"/>
+          </w:tcPr>
+          <w:p>
+            <w:pPr>
+              <w:spacing w:after="0"/>
+            </w:pPr>
+            <w:r>
+              <w:rPr>
+                <w:b w:val="false"/>
+                <w:bCs w:val="false"/>
+                <w:sz w:val="19"/>
+                <w:szCs w:val="19"/>
+              </w:rPr>
+              <w:t xml:space="preserve">미표기</w:t>
+            </w:r>
+          </w:p>
+        </w:tc>
+        <w:tc>
+          <w:tcPr>
+            <w:tcW w:type="dxa" w:w="3106"/>
+            <w:tcMar>
+              <w:top w:type="dxa" w:w="60"/>
+              <w:left w:type="dxa" w:w="100"/>
+              <w:bottom w:type="dxa" w:w="60"/>
+              <w:right w:type="dxa" w:w="100"/>
+            </w:tcMar>
+            <w:vAlign w:val="center"/>
+          </w:tcPr>
+          <w:p>
+            <w:pPr>
+              <w:spacing w:after="0"/>
+            </w:pPr>
+            <w:r>
+              <w:rPr>
+                <w:b w:val="false"/>
+                <w:bCs w:val="false"/>
+                <w:sz w:val="19"/>
+                <w:szCs w:val="19"/>
+              </w:rPr>
+              <w:t xml:space="preserve">1년 갱신 관행 기준 240일 초과 — 5-2 참조</w:t>
+            </w:r>
+          </w:p>
+        </w:tc>
+      </w:tr>
+      <w:tr>
+        <w:tc>
+          <w:tcPr>
+            <w:tcW w:type="dxa" w:w="2600"/>
+            <w:tcMar>
+              <w:top w:type="dxa" w:w="60"/>
+              <w:left w:type="dxa" w:w="100"/>
+              <w:bottom w:type="dxa" w:w="60"/>
+              <w:right w:type="dxa" w:w="100"/>
+            </w:tcMar>
+            <w:vAlign w:val="center"/>
+          </w:tcPr>
+          <w:p>
+            <w:pPr>
+              <w:spacing w:after="0"/>
+            </w:pPr>
+            <w:r>
+              <w:rPr>
+                <w:b w:val="false"/>
+                <w:bCs w:val="false"/>
+                <w:sz w:val="19"/>
+                <w:szCs w:val="19"/>
+              </w:rPr>
+              <w:t xml:space="preserve">견적서 BTA-F0515-001</w:t>
+            </w:r>
+          </w:p>
+        </w:tc>
+        <w:tc>
+          <w:tcPr>
+            <w:tcW w:type="dxa" w:w="2000"/>
+            <w:tcMar>
+              <w:top w:type="dxa" w:w="60"/>
+              <w:left w:type="dxa" w:w="100"/>
+              <w:bottom w:type="dxa" w:w="60"/>
+              <w:right w:type="dxa" w:w="100"/>
+            </w:tcMar>
+            <w:vAlign w:val="center"/>
+          </w:tcPr>
+          <w:p>
+            <w:pPr>
+              <w:spacing w:after="0"/>
+            </w:pPr>
+            <w:r>
+              <w:rPr>
+                <w:b w:val="false"/>
+                <w:bCs w:val="false"/>
+                <w:sz w:val="19"/>
+                <w:szCs w:val="19"/>
+              </w:rPr>
+              <w:t xml:space="preserve">—</w:t>
+            </w:r>
+          </w:p>
+        </w:tc>
+        <w:tc>
+          <w:tcPr>
+            <w:tcW w:type="dxa" w:w="1600"/>
+            <w:tcMar>
+              <w:top w:type="dxa" w:w="60"/>
+              <w:left w:type="dxa" w:w="100"/>
+              <w:bottom w:type="dxa" w:w="60"/>
+              <w:right w:type="dxa" w:w="100"/>
+            </w:tcMar>
+            <w:vAlign w:val="center"/>
+          </w:tcPr>
+          <w:p>
+            <w:pPr>
+              <w:spacing w:after="0"/>
+            </w:pPr>
+            <w:r>
+              <w:rPr>
+                <w:b w:val="false"/>
+                <w:bCs w:val="false"/>
+                <w:sz w:val="19"/>
+                <w:szCs w:val="19"/>
+              </w:rPr>
+              <w:t xml:space="preserve">2026-05-20</w:t>
+            </w:r>
+          </w:p>
+        </w:tc>
+        <w:tc>
+          <w:tcPr>
+            <w:tcW w:type="dxa" w:w="3106"/>
+            <w:tcMar>
+              <w:top w:type="dxa" w:w="60"/>
+              <w:left w:type="dxa" w:w="100"/>
+              <w:bottom w:type="dxa" w:w="60"/>
+              <w:right w:type="dxa" w:w="100"/>
+            </w:tcMar>
+            <w:vAlign w:val="center"/>
+          </w:tcPr>
+          <w:p>
+            <w:pPr>
+              <w:spacing w:after="0"/>
+            </w:pPr>
+            <w:r>
+              <w:rPr>
+                <w:b w:val="false"/>
+                <w:bCs w:val="false"/>
+                <w:sz w:val="19"/>
+                <w:szCs w:val="19"/>
+              </w:rPr>
+              <w:t xml:space="preserve">유효기간 경과 (81일)</w:t>
+            </w:r>
+          </w:p>
+        </w:tc>
+      </w:tr>
+      <w:tr>
+        <w:tc>
+          <w:tcPr>
+            <w:tcW w:type="dxa" w:w="2600"/>
+            <w:tcMar>
+              <w:top w:type="dxa" w:w="60"/>
+              <w:left w:type="dxa" w:w="100"/>
+              <w:bottom w:type="dxa" w:w="60"/>
+              <w:right w:type="dxa" w:w="100"/>
+            </w:tcMar>
+            <w:vAlign w:val="center"/>
+          </w:tcPr>
+          <w:p>
+            <w:pPr>
+              <w:spacing w:after="0"/>
+            </w:pPr>
+            <w:r>
+              <w:rPr>
+                <w:b w:val="false"/>
+                <w:bCs w:val="false"/>
+                <w:sz w:val="19"/>
+                <w:szCs w:val="19"/>
+              </w:rPr>
+              <w:t xml:space="preserve">견적서 BTA-F0623-001</w:t>
+            </w:r>
+          </w:p>
+        </w:tc>
+        <w:tc>
+          <w:tcPr>
+            <w:tcW w:type="dxa" w:w="2000"/>
+            <w:tcMar>
+              <w:top w:type="dxa" w:w="60"/>
+              <w:left w:type="dxa" w:w="100"/>
+              <w:bottom w:type="dxa" w:w="60"/>
+              <w:right w:type="dxa" w:w="100"/>
+            </w:tcMar>
+            <w:vAlign w:val="center"/>
+          </w:tcPr>
+          <w:p>
+            <w:pPr>
+              <w:spacing w:after="0"/>
+            </w:pPr>
+            <w:r>
+              <w:rPr>
+                <w:b w:val="false"/>
+                <w:bCs w:val="false"/>
+                <w:sz w:val="19"/>
+                <w:szCs w:val="19"/>
+              </w:rPr>
+              <w:t xml:space="preserve">—</w:t>
+            </w:r>
+          </w:p>
+        </w:tc>
+        <w:tc>
+          <w:tcPr>
+            <w:tcW w:type="dxa" w:w="1600"/>
+            <w:tcMar>
+              <w:top w:type="dxa" w:w="60"/>
+              <w:left w:type="dxa" w:w="100"/>
+              <w:bottom w:type="dxa" w:w="60"/>
+              <w:right w:type="dxa" w:w="100"/>
+            </w:tcMar>
+            <w:vAlign w:val="center"/>
+          </w:tcPr>
+          <w:p>
+            <w:pPr>
+              <w:spacing w:after="0"/>
+            </w:pPr>
+            <w:r>
+              <w:rPr>
+                <w:b w:val="false"/>
+                <w:bCs w:val="false"/>
+                <w:sz w:val="19"/>
+                <w:szCs w:val="19"/>
+              </w:rPr>
+              <w:t xml:space="preserve">2026-06-28</w:t>
+            </w:r>
+          </w:p>
+        </w:tc>
+        <w:tc>
+          <w:tcPr>
+            <w:tcW w:type="dxa" w:w="3106"/>
+            <w:tcMar>
+              <w:top w:type="dxa" w:w="60"/>
+              <w:left w:type="dxa" w:w="100"/>
+              <w:bottom w:type="dxa" w:w="60"/>
+              <w:right w:type="dxa" w:w="100"/>
+            </w:tcMar>
+            <w:vAlign w:val="center"/>
+          </w:tcPr>
+          <w:p>
+            <w:pPr>
+              <w:spacing w:after="0"/>
+            </w:pPr>
+            <w:r>
+              <w:rPr>
+                <w:b w:val="false"/>
+                <w:bCs w:val="false"/>
+                <w:sz w:val="19"/>
+                <w:szCs w:val="19"/>
+              </w:rPr>
+              <w:t xml:space="preserve">유효기간 경과 (42일)</w:t>
+            </w:r>
+          </w:p>
+        </w:tc>
+      </w:tr>
+      <w:tr>
+        <w:tc>
+          <w:tcPr>
+            <w:tcW w:type="dxa" w:w="2600"/>
+            <w:tcMar>
+              <w:top w:type="dxa" w:w="60"/>
+              <w:left w:type="dxa" w:w="100"/>
+              <w:bottom w:type="dxa" w:w="60"/>
+              <w:right w:type="dxa" w:w="100"/>
+            </w:tcMar>
+            <w:vAlign w:val="center"/>
+          </w:tcPr>
+          <w:p>
+            <w:pPr>
+              <w:spacing w:after="0"/>
+            </w:pPr>
+            <w:r>
+              <w:rPr>
+                <w:b w:val="false"/>
+                <w:bCs w:val="false"/>
+                <w:sz w:val="19"/>
+                <w:szCs w:val="19"/>
+              </w:rPr>
+              <w:t xml:space="preserve">박사후 창신실천기지 현판</w:t>
+            </w:r>
+          </w:p>
+        </w:tc>
+        <w:tc>
+          <w:tcPr>
+            <w:tcW w:type="dxa" w:w="2000"/>
+            <w:tcMar>
+              <w:top w:type="dxa" w:w="60"/>
+              <w:left w:type="dxa" w:w="100"/>
+              <w:bottom w:type="dxa" w:w="60"/>
+              <w:right w:type="dxa" w:w="100"/>
+            </w:tcMar>
+            <w:vAlign w:val="center"/>
+          </w:tcPr>
+          <w:p>
+            <w:pPr>
+              <w:spacing w:after="0"/>
+            </w:pPr>
+            <w:r>
+              <w:rPr>
+                <w:b w:val="false"/>
+                <w:bCs w:val="false"/>
+                <w:sz w:val="19"/>
+                <w:szCs w:val="19"/>
+              </w:rPr>
+              <w:t xml:space="preserve">—</w:t>
+            </w:r>
+          </w:p>
+        </w:tc>
+        <w:tc>
+          <w:tcPr>
+            <w:tcW w:type="dxa" w:w="1600"/>
+            <w:tcMar>
+              <w:top w:type="dxa" w:w="60"/>
+              <w:left w:type="dxa" w:w="100"/>
+              <w:bottom w:type="dxa" w:w="60"/>
+              <w:right w:type="dxa" w:w="100"/>
+            </w:tcMar>
+            <w:vAlign w:val="center"/>
+          </w:tcPr>
+          <w:p>
+            <w:pPr>
+              <w:spacing w:after="0"/>
+            </w:pPr>
+            <w:r>
+              <w:rPr>
+                <w:b w:val="false"/>
+                <w:bCs w:val="false"/>
+                <w:sz w:val="19"/>
+                <w:szCs w:val="19"/>
+              </w:rPr>
+              <w:t xml:space="preserve">—</w:t>
+            </w:r>
+          </w:p>
+        </w:tc>
+        <w:tc>
+          <w:tcPr>
+            <w:tcW w:type="dxa" w:w="3106"/>
+            <w:tcMar>
+              <w:top w:type="dxa" w:w="60"/>
+              <w:left w:type="dxa" w:w="100"/>
+              <w:bottom w:type="dxa" w:w="60"/>
+              <w:right w:type="dxa" w:w="100"/>
+            </w:tcMar>
+            <w:vAlign w:val="center"/>
+          </w:tcPr>
+          <w:p>
+            <w:pPr>
+              <w:spacing w:after="0"/>
+            </w:pPr>
+            <w:r>
+              <w:rPr>
+                <w:b w:val="false"/>
+                <w:bCs w:val="false"/>
+                <w:sz w:val="19"/>
+                <w:szCs w:val="19"/>
+              </w:rPr>
+              <w:t xml:space="preserve">표창성 현판, 품질 인증 아님</w:t>
+            </w:r>
+          </w:p>
+        </w:tc>
+      </w:tr>
+    </w:tbl>
     <w:p>
       <w:pPr>
         <w:pStyle w:val="Heading2"/>
@@ -5431,7 +6722,7 @@
           <w:sz w:val="22"/>
           <w:szCs w:val="22"/>
         </w:rPr>
-        <w:t xml:space="preserve">A. 회사 자료 (거래처 등록·실사 대응)</w:t>
+        <w:t xml:space="preserve">5-1. 만료 인증서 2건 — 즉시 조치 필요</w:t>
       </w:r>
     </w:p>
     <w:p>
@@ -5445,12 +6736,10 @@
       </w:pPr>
       <w:r>
         <w:rPr>
-          <w:b w:val="false"/>
-          <w:bCs w:val="false"/>
           <w:sz w:val="20"/>
           <w:szCs w:val="20"/>
         </w:rPr>
-        <w:t xml:space="preserve">사업자등록증(营业执照) 사본 — 통일사회신용코드 포함</w:t>
+        <w:t xml:space="preserve">ISO 9001:2015 — 발급기관 Shandong Quality Certification Co., Ltd(ZZRZ), 인증 범위 "Aluminum profile processing". 2025-09-26 만료 후 갱신본 미제출. 갱신 인증서 사본 요청 필수이며, 수령 시 CNCA(www.cnca.gov.cn) 또는 발급기관(www.sqcc-china.com)에서 조회 검증할 것.</w:t>
       </w:r>
     </w:p>
     <w:p>
@@ -5464,12 +6753,632 @@
       </w:pPr>
       <w:r>
         <w:rPr>
+          <w:sz w:val="20"/>
+          <w:szCs w:val="20"/>
+        </w:rPr>
+        <w:t xml:space="preserve">SGS Gold Plus — 알리바바 골드공급사 현장심사 증서, 2025-10-14 만료. 알리바바 페이지에 표기가 남아 있어도 증서 자체는 실효 상태이므로 재심사 완료본을 요청할 것.</w:t>
+      </w:r>
+    </w:p>
+    <w:p>
+      <w:pPr>
+        <w:pStyle w:val="Heading2"/>
+        <w:spacing w:after="100" w:before="220"/>
+      </w:pPr>
+      <w:r>
+        <w:rPr>
+          <w:b/>
+          <w:bCs/>
+          <w:color w:val="5A9A96"/>
+          <w:sz w:val="22"/>
+          <w:szCs w:val="22"/>
+        </w:rPr>
+        <w:t xml:space="preserve">5-2. CE 자료 — 명칭과 실질이 다름 (중요)</w:t>
+      </w:r>
+    </w:p>
+    <w:p>
+      <w:pPr>
+        <w:pStyle w:val="ListParagraph"/>
+        <w:numPr>
+          <w:ilvl w:val="0"/>
+          <w:numId w:val="5"/>
+        </w:numPr>
+        <w:spacing w:after="60"/>
+      </w:pPr>
+      <w:r>
+        <w:rPr>
+          <w:sz w:val="20"/>
+          <w:szCs w:val="20"/>
+        </w:rPr>
+        <w:t xml:space="preserve">수령한 CE.pdf는 통상의 CE 인증서가 아니라 RoHS 적합성 증서(Certificate of Conformity)임. 발급처는 Guangdong KEYS Testing Technology Co., Ltd (민간 시험소).</w:t>
+      </w:r>
+    </w:p>
+    <w:p>
+      <w:pPr>
+        <w:pStyle w:val="ListParagraph"/>
+        <w:numPr>
+          <w:ilvl w:val="0"/>
+          <w:numId w:val="5"/>
+        </w:numPr>
+        <w:spacing w:after="60"/>
+      </w:pPr>
+      <w:r>
+        <w:rPr>
+          <w:sz w:val="20"/>
+          <w:szCs w:val="20"/>
+        </w:rPr>
+        <w:t xml:space="preserve">근거 지침은 RoHS 2.0 (EU) 2015/863 · (EU) 2017/2102로, CE 마킹 지침이 아님. 대상 제품은 Aluminum profiles (6063, 6005, 6061, 6082, 1070, 1050).</w:t>
+      </w:r>
+    </w:p>
+    <w:p>
+      <w:pPr>
+        <w:pStyle w:val="ListParagraph"/>
+        <w:numPr>
+          <w:ilvl w:val="0"/>
+          <w:numId w:val="5"/>
+        </w:numPr>
+        <w:spacing w:after="60"/>
+      </w:pPr>
+      <w:r>
+        <w:rPr>
+          <w:sz w:val="20"/>
+          <w:szCs w:val="20"/>
+        </w:rPr>
+        <w:t xml:space="preserve">증서 본문에 "applies to the tested sample above mentioned only and shall not imply an assessment of the whole production"으로 명시 — 제출 시료 한정이며 양산품 보증이 아니고, 시험성적서 RKEYS241209039와 함께여야 유효함.</w:t>
+      </w:r>
+    </w:p>
+    <w:p>
+      <w:pPr>
+        <w:pStyle w:val="ListParagraph"/>
+        <w:numPr>
+          <w:ilvl w:val="0"/>
+          <w:numId w:val="5"/>
+        </w:numPr>
+        <w:spacing w:after="60"/>
+      </w:pPr>
+      <w:r>
+        <w:rPr>
+          <w:sz w:val="20"/>
+          <w:szCs w:val="20"/>
+        </w:rPr>
+        <w:t xml:space="preserve">상표가 "Broadcom Aluminum"으로 표기되어 명함·홈페이지의 "Botong Aluminum"과 불일치.</w:t>
+      </w:r>
+    </w:p>
+    <w:p>
+      <w:pPr>
+        <w:spacing w:after="80"/>
+      </w:pPr>
+      <w:r>
+        <w:rPr>
+          <w:b/>
+          <w:bCs/>
+          <w:sz w:val="20"/>
+          <w:szCs w:val="20"/>
+        </w:rPr>
+        <w:t xml:space="preserve">유효기간 판정 (발행일 2024-12-12, 오늘로 605일 경과) — 증서에 만료일 미인쇄. RoHS 계열은 법정 만료일이 없어 아래 세 기준으로 판단.</w:t>
+      </w:r>
+    </w:p>
+    <w:tbl>
+      <w:tblPr>
+        <w:tblW w:type="dxa" w:w="9306"/>
+        <w:tblBorders>
+          <w:top w:val="single" w:color="auto" w:sz="4"/>
+          <w:left w:val="single" w:color="auto" w:sz="4"/>
+          <w:bottom w:val="single" w:color="auto" w:sz="4"/>
+          <w:right w:val="single" w:color="auto" w:sz="4"/>
+          <w:insideH w:val="single" w:color="auto" w:sz="4"/>
+          <w:insideV w:val="single" w:color="auto" w:sz="4"/>
+        </w:tblBorders>
+      </w:tblPr>
+      <w:tblGrid>
+        <w:gridCol w:w="4200"/>
+        <w:gridCol w:w="2400"/>
+        <w:gridCol w:w="2706"/>
+      </w:tblGrid>
+      <w:tr>
+        <w:tc>
+          <w:tcPr>
+            <w:tcW w:type="dxa" w:w="4200"/>
+            <w:shd w:fill="E4EEF1" w:val="clear"/>
+            <w:tcMar>
+              <w:top w:type="dxa" w:w="60"/>
+              <w:left w:type="dxa" w:w="100"/>
+              <w:bottom w:type="dxa" w:w="60"/>
+              <w:right w:type="dxa" w:w="100"/>
+            </w:tcMar>
+            <w:vAlign w:val="center"/>
+          </w:tcPr>
+          <w:p>
+            <w:pPr>
+              <w:spacing w:after="0"/>
+            </w:pPr>
+            <w:r>
+              <w:rPr>
+                <w:b/>
+                <w:bCs/>
+                <w:color w:val="2E5878"/>
+                <w:sz w:val="19"/>
+                <w:szCs w:val="19"/>
+              </w:rPr>
+              <w:t xml:space="preserve">기준</w:t>
+            </w:r>
+          </w:p>
+        </w:tc>
+        <w:tc>
+          <w:tcPr>
+            <w:tcW w:type="dxa" w:w="2400"/>
+            <w:shd w:fill="E4EEF1" w:val="clear"/>
+            <w:tcMar>
+              <w:top w:type="dxa" w:w="60"/>
+              <w:left w:type="dxa" w:w="100"/>
+              <w:bottom w:type="dxa" w:w="60"/>
+              <w:right w:type="dxa" w:w="100"/>
+            </w:tcMar>
+            <w:vAlign w:val="center"/>
+          </w:tcPr>
+          <w:p>
+            <w:pPr>
+              <w:spacing w:after="0"/>
+            </w:pPr>
+            <w:r>
+              <w:rPr>
+                <w:b/>
+                <w:bCs/>
+                <w:color w:val="2E5878"/>
+                <w:sz w:val="19"/>
+                <w:szCs w:val="19"/>
+              </w:rPr>
+              <w:t xml:space="preserve">만료 시점</w:t>
+            </w:r>
+          </w:p>
+        </w:tc>
+        <w:tc>
+          <w:tcPr>
+            <w:tcW w:type="dxa" w:w="2706"/>
+            <w:shd w:fill="E4EEF1" w:val="clear"/>
+            <w:tcMar>
+              <w:top w:type="dxa" w:w="60"/>
+              <w:left w:type="dxa" w:w="100"/>
+              <w:bottom w:type="dxa" w:w="60"/>
+              <w:right w:type="dxa" w:w="100"/>
+            </w:tcMar>
+            <w:vAlign w:val="center"/>
+          </w:tcPr>
+          <w:p>
+            <w:pPr>
+              <w:spacing w:after="0"/>
+            </w:pPr>
+            <w:r>
+              <w:rPr>
+                <w:b/>
+                <w:bCs/>
+                <w:color w:val="2E5878"/>
+                <w:sz w:val="19"/>
+                <w:szCs w:val="19"/>
+              </w:rPr>
+              <w:t xml:space="preserve">현재 상태</w:t>
+            </w:r>
+          </w:p>
+        </w:tc>
+      </w:tr>
+      <w:tr>
+        <w:tc>
+          <w:tcPr>
+            <w:tcW w:type="dxa" w:w="4200"/>
+            <w:tcMar>
+              <w:top w:type="dxa" w:w="60"/>
+              <w:left w:type="dxa" w:w="100"/>
+              <w:bottom w:type="dxa" w:w="60"/>
+              <w:right w:type="dxa" w:w="100"/>
+            </w:tcMar>
+            <w:vAlign w:val="center"/>
+          </w:tcPr>
+          <w:p>
+            <w:pPr>
+              <w:spacing w:after="0"/>
+            </w:pPr>
+            <w:r>
+              <w:rPr>
+                <w:b w:val="false"/>
+                <w:bCs w:val="false"/>
+                <w:sz w:val="19"/>
+                <w:szCs w:val="19"/>
+              </w:rPr>
+              <w:t xml:space="preserve">구매자 연간 갱신 관행 (가장 일반적)</w:t>
+            </w:r>
+          </w:p>
+        </w:tc>
+        <w:tc>
+          <w:tcPr>
+            <w:tcW w:type="dxa" w:w="2400"/>
+            <w:tcMar>
+              <w:top w:type="dxa" w:w="60"/>
+              <w:left w:type="dxa" w:w="100"/>
+              <w:bottom w:type="dxa" w:w="60"/>
+              <w:right w:type="dxa" w:w="100"/>
+            </w:tcMar>
+            <w:vAlign w:val="center"/>
+          </w:tcPr>
+          <w:p>
+            <w:pPr>
+              <w:spacing w:after="0"/>
+            </w:pPr>
+            <w:r>
+              <w:rPr>
+                <w:b w:val="false"/>
+                <w:bCs w:val="false"/>
+                <w:sz w:val="19"/>
+                <w:szCs w:val="19"/>
+              </w:rPr>
+              <w:t xml:space="preserve">2025-12-12</w:t>
+            </w:r>
+          </w:p>
+        </w:tc>
+        <w:tc>
+          <w:tcPr>
+            <w:tcW w:type="dxa" w:w="2706"/>
+            <w:tcMar>
+              <w:top w:type="dxa" w:w="60"/>
+              <w:left w:type="dxa" w:w="100"/>
+              <w:bottom w:type="dxa" w:w="60"/>
+              <w:right w:type="dxa" w:w="100"/>
+            </w:tcMar>
+            <w:vAlign w:val="center"/>
+          </w:tcPr>
+          <w:p>
+            <w:pPr>
+              <w:spacing w:after="0"/>
+            </w:pPr>
+            <w:r>
+              <w:rPr>
+                <w:b w:val="false"/>
+                <w:bCs w:val="false"/>
+                <w:sz w:val="19"/>
+                <w:szCs w:val="19"/>
+              </w:rPr>
+              <w:t xml:space="preserve">240일 경과</w:t>
+            </w:r>
+          </w:p>
+        </w:tc>
+      </w:tr>
+      <w:tr>
+        <w:tc>
+          <w:tcPr>
+            <w:tcW w:type="dxa" w:w="4200"/>
+            <w:tcMar>
+              <w:top w:type="dxa" w:w="60"/>
+              <w:left w:type="dxa" w:w="100"/>
+              <w:bottom w:type="dxa" w:w="60"/>
+              <w:right w:type="dxa" w:w="100"/>
+            </w:tcMar>
+            <w:vAlign w:val="center"/>
+          </w:tcPr>
+          <w:p>
+            <w:pPr>
+              <w:spacing w:after="0"/>
+            </w:pPr>
+            <w:r>
+              <w:rPr>
+                <w:b w:val="false"/>
+                <w:bCs w:val="false"/>
+                <w:sz w:val="19"/>
+                <w:szCs w:val="19"/>
+              </w:rPr>
+              <w:t xml:space="preserve">인증서 통상 유효기간 3년</w:t>
+            </w:r>
+          </w:p>
+        </w:tc>
+        <w:tc>
+          <w:tcPr>
+            <w:tcW w:type="dxa" w:w="2400"/>
+            <w:tcMar>
+              <w:top w:type="dxa" w:w="60"/>
+              <w:left w:type="dxa" w:w="100"/>
+              <w:bottom w:type="dxa" w:w="60"/>
+              <w:right w:type="dxa" w:w="100"/>
+            </w:tcMar>
+            <w:vAlign w:val="center"/>
+          </w:tcPr>
+          <w:p>
+            <w:pPr>
+              <w:spacing w:after="0"/>
+            </w:pPr>
+            <w:r>
+              <w:rPr>
+                <w:b w:val="false"/>
+                <w:bCs w:val="false"/>
+                <w:sz w:val="19"/>
+                <w:szCs w:val="19"/>
+              </w:rPr>
+              <w:t xml:space="preserve">2027-12-12</w:t>
+            </w:r>
+          </w:p>
+        </w:tc>
+        <w:tc>
+          <w:tcPr>
+            <w:tcW w:type="dxa" w:w="2706"/>
+            <w:tcMar>
+              <w:top w:type="dxa" w:w="60"/>
+              <w:left w:type="dxa" w:w="100"/>
+              <w:bottom w:type="dxa" w:w="60"/>
+              <w:right w:type="dxa" w:w="100"/>
+            </w:tcMar>
+            <w:vAlign w:val="center"/>
+          </w:tcPr>
+          <w:p>
+            <w:pPr>
+              <w:spacing w:after="0"/>
+            </w:pPr>
+            <w:r>
+              <w:rPr>
+                <w:b w:val="false"/>
+                <w:bCs w:val="false"/>
+                <w:sz w:val="19"/>
+                <w:szCs w:val="19"/>
+              </w:rPr>
+              <w:t xml:space="preserve">형식상 유효</w:t>
+            </w:r>
+          </w:p>
+        </w:tc>
+      </w:tr>
+      <w:tr>
+        <w:tc>
+          <w:tcPr>
+            <w:tcW w:type="dxa" w:w="4200"/>
+            <w:tcMar>
+              <w:top w:type="dxa" w:w="60"/>
+              <w:left w:type="dxa" w:w="100"/>
+              <w:bottom w:type="dxa" w:w="60"/>
+              <w:right w:type="dxa" w:w="100"/>
+            </w:tcMar>
+            <w:vAlign w:val="center"/>
+          </w:tcPr>
+          <w:p>
+            <w:pPr>
+              <w:spacing w:after="0"/>
+            </w:pPr>
+            <w:r>
+              <w:rPr>
+                <w:b w:val="false"/>
+                <w:bCs w:val="false"/>
+                <w:sz w:val="19"/>
+                <w:szCs w:val="19"/>
+              </w:rPr>
+              <w:t xml:space="preserve">자재·공정·표준 불변 시 무기한</w:t>
+            </w:r>
+          </w:p>
+        </w:tc>
+        <w:tc>
+          <w:tcPr>
+            <w:tcW w:type="dxa" w:w="2400"/>
+            <w:tcMar>
+              <w:top w:type="dxa" w:w="60"/>
+              <w:left w:type="dxa" w:w="100"/>
+              <w:bottom w:type="dxa" w:w="60"/>
+              <w:right w:type="dxa" w:w="100"/>
+            </w:tcMar>
+            <w:vAlign w:val="center"/>
+          </w:tcPr>
+          <w:p>
+            <w:pPr>
+              <w:spacing w:after="0"/>
+            </w:pPr>
+            <w:r>
+              <w:rPr>
+                <w:b w:val="false"/>
+                <w:bCs w:val="false"/>
+                <w:sz w:val="19"/>
+                <w:szCs w:val="19"/>
+              </w:rPr>
+              <w:t xml:space="preserve">—</w:t>
+            </w:r>
+          </w:p>
+        </w:tc>
+        <w:tc>
+          <w:tcPr>
+            <w:tcW w:type="dxa" w:w="2706"/>
+            <w:tcMar>
+              <w:top w:type="dxa" w:w="60"/>
+              <w:left w:type="dxa" w:w="100"/>
+              <w:bottom w:type="dxa" w:w="60"/>
+              <w:right w:type="dxa" w:w="100"/>
+            </w:tcMar>
+            <w:vAlign w:val="center"/>
+          </w:tcPr>
+          <w:p>
+            <w:pPr>
+              <w:spacing w:after="0"/>
+            </w:pPr>
+            <w:r>
+              <w:rPr>
+                <w:b w:val="false"/>
+                <w:bCs w:val="false"/>
+                <w:sz w:val="19"/>
+                <w:szCs w:val="19"/>
+              </w:rPr>
+              <w:t xml:space="preserve">형식상 유효</w:t>
+            </w:r>
+          </w:p>
+        </w:tc>
+      </w:tr>
+    </w:tbl>
+    <w:p>
+      <w:pPr>
+        <w:spacing w:after="80"/>
+      </w:pPr>
+      <w:r>
+        <w:rPr>
+          <w:b/>
+          <w:bCs/>
+          <w:sz w:val="20"/>
+          <w:szCs w:val="20"/>
+        </w:rPr>
+        <w:t xml:space="preserve">실무 판정: "만료일 없음"이 아니라 "1년 갱신 관행 기준으로는 이미 기한 초과"로 보는 것이 안전함. 제이에스텍이 연간 갱신을 요구하면 반려 대상이므로 2024-12-12자 증서를 그대로 제출하지 말고 재발행본을 요청하고, 발급 시험소(KEYS)에 유효기간 정책을 서면 확인받을 것. 아울러 제이에스텍이 요구하는 것이 CE 인증인지 RoHS 자료인지 먼저 확인할 것.</w:t>
+      </w:r>
+    </w:p>
+    <w:p>
+      <w:pPr>
+        <w:pStyle w:val="Heading2"/>
+        <w:spacing w:after="100" w:before="220"/>
+      </w:pPr>
+      <w:r>
+        <w:rPr>
+          <w:b/>
+          <w:bCs/>
+          <w:color w:val="5A9A96"/>
+          <w:sz w:val="22"/>
+          <w:szCs w:val="22"/>
+        </w:rPr>
+        <w:t xml:space="preserve">5-3. 사업자등록증에서 확인된 사실</w:t>
+      </w:r>
+    </w:p>
+    <w:p>
+      <w:pPr>
+        <w:pStyle w:val="ListParagraph"/>
+        <w:numPr>
+          <w:ilvl w:val="0"/>
+          <w:numId w:val="6"/>
+        </w:numPr>
+        <w:spacing w:after="60"/>
+      </w:pPr>
+      <w:r>
+        <w:rPr>
+          <w:sz w:val="20"/>
+          <w:szCs w:val="20"/>
+        </w:rPr>
+        <w:t xml:space="preserve">통일사회신용코드 91370832MA3C4K5D8Q — ISO 인증서 기재값과 일치.</w:t>
+      </w:r>
+    </w:p>
+    <w:p>
+      <w:pPr>
+        <w:pStyle w:val="ListParagraph"/>
+        <w:numPr>
+          <w:ilvl w:val="0"/>
+          <w:numId w:val="6"/>
+        </w:numPr>
+        <w:spacing w:after="60"/>
+      </w:pPr>
+      <w:r>
+        <w:rPr>
+          <w:sz w:val="20"/>
+          <w:szCs w:val="20"/>
+        </w:rPr>
+        <w:t xml:space="preserve">법정대표인 艾广远 (Ai Guangyuan) — 담당자 Lawrence를 "方广远(Fang Guangyuan)"으로 기록해 왔으나 성(姓)이 다름. 계약 서명권자 확인을 위해 Lawrence의 정확한 성명·직위 재확인 필요.</w:t>
+      </w:r>
+    </w:p>
+    <w:p>
+      <w:pPr>
+        <w:pStyle w:val="ListParagraph"/>
+        <w:numPr>
+          <w:ilvl w:val="0"/>
+          <w:numId w:val="6"/>
+        </w:numPr>
+        <w:spacing w:after="60"/>
+      </w:pPr>
+      <w:r>
+        <w:rPr>
+          <w:sz w:val="20"/>
+          <w:szCs w:val="20"/>
+        </w:rPr>
+        <w:t xml:space="preserve">등록자본금 2,100만元 — 홈페이지의 5,000만/7,000만元은 모그룹(远通集团) 수치이므로 혼동 주의. 제출 시에는 사업자등록증 값을 사용할 것.</w:t>
+      </w:r>
+    </w:p>
+    <w:p>
+      <w:pPr>
+        <w:pStyle w:val="ListParagraph"/>
+        <w:numPr>
+          <w:ilvl w:val="0"/>
+          <w:numId w:val="6"/>
+        </w:numPr>
+        <w:spacing w:after="60"/>
+      </w:pPr>
+      <w:r>
+        <w:rPr>
+          <w:sz w:val="20"/>
+          <w:szCs w:val="20"/>
+        </w:rPr>
+        <w:t xml:space="preserve">경영범위는 铝型材及制品加工·销售 (알루미늄 형재 및 제품 가공·판매)이며, 나머지 항목은 철강 계열. 알루미늄 부문에 냉간인발(冷拔)·무계목관(无缝管) 표기가 없음.</w:t>
+      </w:r>
+    </w:p>
+    <w:p>
+      <w:pPr>
+        <w:pStyle w:val="ListParagraph"/>
+        <w:numPr>
+          <w:ilvl w:val="0"/>
+          <w:numId w:val="6"/>
+        </w:numPr>
+        <w:spacing w:after="60"/>
+      </w:pPr>
+      <w:r>
+        <w:rPr>
+          <w:sz w:val="20"/>
+          <w:szCs w:val="20"/>
+        </w:rPr>
+        <w:t xml:space="preserve">ISO 인증 범위("Aluminum profile processing")와 사업자등록증 경영범위가 모두 "형재 가공"에 한정 — 우리가 요구하는 6061-T6 Cold Drawn Seamless Tube는 Botong의 등록·인증 범위 밖일 가능성이 높음. φ450·φ460 외주 조달 추정을 뒷받침하며 Group A·B에도 동일하게 적용되는 문제임.</w:t>
+      </w:r>
+    </w:p>
+    <w:p>
+      <w:pPr>
+        <w:pStyle w:val="Heading2"/>
+        <w:spacing w:after="100" w:before="220"/>
+      </w:pPr>
+      <w:r>
+        <w:rPr>
+          <w:b/>
+          <w:bCs/>
+          <w:color w:val="5A9A96"/>
+          <w:sz w:val="22"/>
+          <w:szCs w:val="22"/>
+        </w:rPr>
+        <w:t xml:space="preserve">5-4. 아직 미수령 자료</w:t>
+      </w:r>
+    </w:p>
+    <w:p>
+      <w:pPr>
+        <w:spacing w:after="80"/>
+      </w:pPr>
+      <w:r>
+        <w:rPr>
           <w:b w:val="false"/>
           <w:bCs w:val="false"/>
           <w:sz w:val="20"/>
           <w:szCs w:val="20"/>
         </w:rPr>
-        <w:t xml:space="preserve">회사소개서 (영문) — 연혁, 조직, 설비 리스트, 생산능력</w:t>
+        <w:t xml:space="preserve">MTC(재질증명서), 치수·진원도 검사성적서, 영문 회사소개서, 수출자격 증빙(대외무역경영자 등록), 은행 계좌 정보, 수출품 품질허가증, 공장·설비 사진 — 전부 미수령.</w:t>
+      </w:r>
+    </w:p>
+    <w:p>
+      <w:pPr>
+        <w:pStyle w:val="Heading1"/>
+        <w:pBdr>
+          <w:bottom w:val="single" w:color="5A9A96" w:sz="4"/>
+        </w:pBdr>
+        <w:spacing w:after="140" w:before="340"/>
+      </w:pPr>
+      <w:r>
+        <w:rPr>
+          <w:b/>
+          <w:bCs/>
+          <w:color w:val="2E5878"/>
+          <w:sz w:val="26"/>
+          <w:szCs w:val="26"/>
+        </w:rPr>
+        <w:t xml:space="preserve">6. 제이에스텍 / 제이에스엠텍 제출 대비 — Botong 요청 서류 체크리스트</w:t>
+      </w:r>
+    </w:p>
+    <w:p>
+      <w:pPr>
+        <w:pStyle w:val="Heading2"/>
+        <w:spacing w:after="100" w:before="220"/>
+      </w:pPr>
+      <w:r>
+        <w:rPr>
+          <w:b/>
+          <w:bCs/>
+          <w:color w:val="5A9A96"/>
+          <w:sz w:val="22"/>
+          <w:szCs w:val="22"/>
+        </w:rPr>
+        <w:t xml:space="preserve">A. 회사 자료 (거래처 등록·실사 대응)</w:t>
       </w:r>
     </w:p>
     <w:p>
@@ -5477,7 +7386,7 @@
         <w:pStyle w:val="ListParagraph"/>
         <w:numPr>
           <w:ilvl w:val="0"/>
-          <w:numId w:val="4"/>
+          <w:numId w:val="7"/>
         </w:numPr>
         <w:spacing w:after="60"/>
       </w:pPr>
@@ -5488,7 +7397,7 @@
           <w:sz w:val="20"/>
           <w:szCs w:val="20"/>
         </w:rPr>
-        <w:t xml:space="preserve">공장·설비 사진 및 생산라인 사양 (압출기 톤수, 인발 설비 유무 포함)</w:t>
+        <w:t xml:space="preserve">사업자등록증(营业执照) 사본 — 통일사회신용코드 포함  ✅ 수령·유효</w:t>
       </w:r>
     </w:p>
     <w:p>
@@ -5496,7 +7405,7 @@
         <w:pStyle w:val="ListParagraph"/>
         <w:numPr>
           <w:ilvl w:val="0"/>
-          <w:numId w:val="4"/>
+          <w:numId w:val="7"/>
         </w:numPr>
         <w:spacing w:after="60"/>
       </w:pPr>
@@ -5507,7 +7416,7 @@
           <w:sz w:val="20"/>
           <w:szCs w:val="20"/>
         </w:rPr>
-        <w:t xml:space="preserve">수출 자격 증빙 (대외무역경영자 등록 등)</w:t>
+        <w:t xml:space="preserve">회사소개서 (영문) — 연혁, 조직, 설비 리스트, 생산능력</w:t>
       </w:r>
     </w:p>
     <w:p>
@@ -5515,7 +7424,45 @@
         <w:pStyle w:val="ListParagraph"/>
         <w:numPr>
           <w:ilvl w:val="0"/>
-          <w:numId w:val="4"/>
+          <w:numId w:val="7"/>
+        </w:numPr>
+        <w:spacing w:after="60"/>
+      </w:pPr>
+      <w:r>
+        <w:rPr>
+          <w:b w:val="false"/>
+          <w:bCs w:val="false"/>
+          <w:sz w:val="20"/>
+          <w:szCs w:val="20"/>
+        </w:rPr>
+        <w:t xml:space="preserve">공장·설비 사진 및 생산라인 사양 (압출기 톤수, 인발 설비 유무 포함)</w:t>
+      </w:r>
+    </w:p>
+    <w:p>
+      <w:pPr>
+        <w:pStyle w:val="ListParagraph"/>
+        <w:numPr>
+          <w:ilvl w:val="0"/>
+          <w:numId w:val="7"/>
+        </w:numPr>
+        <w:spacing w:after="60"/>
+      </w:pPr>
+      <w:r>
+        <w:rPr>
+          <w:b w:val="false"/>
+          <w:bCs w:val="false"/>
+          <w:sz w:val="20"/>
+          <w:szCs w:val="20"/>
+        </w:rPr>
+        <w:t xml:space="preserve">수출 자격 증빙 (대외무역경영자 등록 등)</w:t>
+      </w:r>
+    </w:p>
+    <w:p>
+      <w:pPr>
+        <w:pStyle w:val="ListParagraph"/>
+        <w:numPr>
+          <w:ilvl w:val="0"/>
+          <w:numId w:val="7"/>
         </w:numPr>
         <w:spacing w:after="60"/>
       </w:pPr>
@@ -5592,7 +7539,7 @@
         <w:pStyle w:val="ListParagraph"/>
         <w:numPr>
           <w:ilvl w:val="0"/>
-          <w:numId w:val="4"/>
+          <w:numId w:val="7"/>
         </w:numPr>
         <w:spacing w:after="60"/>
       </w:pPr>
@@ -5603,7 +7550,7 @@
           <w:sz w:val="20"/>
           <w:szCs w:val="20"/>
         </w:rPr>
-        <w:t xml:space="preserve">ISO 9001:2015 인증서 — 발급기관·인증 범위·유효기간(만료일) 확인, 발급기관 조회로 유효성 검증</w:t>
+        <w:t xml:space="preserve">ISO 9001:2015 인증서 — 수령분 2025-09-26 만료 → 갱신본 재요청 필요, 발급기관 조회로 유효성 검증</w:t>
       </w:r>
     </w:p>
     <w:p>
@@ -5611,7 +7558,7 @@
         <w:pStyle w:val="ListParagraph"/>
         <w:numPr>
           <w:ilvl w:val="0"/>
-          <w:numId w:val="4"/>
+          <w:numId w:val="7"/>
         </w:numPr>
         <w:spacing w:after="60"/>
       </w:pPr>
@@ -5622,7 +7569,7 @@
           <w:sz w:val="20"/>
           <w:szCs w:val="20"/>
         </w:rPr>
-        <w:t xml:space="preserve">CE 인증서 — 적용 제품 범위 확인 (알루미늄 관재 적용 지침 검증 필요), 유효기간 확인</w:t>
+        <w:t xml:space="preserve">CE 인증서 — 수령분은 RoHS 적합성 증서(시료 한정)로 CE 인증서 아님 → 요구 자료 성격 재확인 및 재발행 요청 (5-2 참조)</w:t>
       </w:r>
     </w:p>
     <w:p>
@@ -5630,7 +7577,7 @@
         <w:pStyle w:val="ListParagraph"/>
         <w:numPr>
           <w:ilvl w:val="0"/>
-          <w:numId w:val="4"/>
+          <w:numId w:val="7"/>
         </w:numPr>
         <w:spacing w:after="60"/>
       </w:pPr>
@@ -5641,7 +7588,7 @@
           <w:sz w:val="20"/>
           <w:szCs w:val="20"/>
         </w:rPr>
-        <w:t xml:space="preserve">SGS 감사보고서 (Alibaba Gold Plus) — 감사일자·유효기간 확인</w:t>
+        <w:t xml:space="preserve">SGS 감사보고서 (Alibaba Gold Plus) — 수령분 2025-10-14 만료 → 재심사본 요청 필요</w:t>
       </w:r>
     </w:p>
     <w:p>
@@ -5649,7 +7596,7 @@
         <w:pStyle w:val="ListParagraph"/>
         <w:numPr>
           <w:ilvl w:val="0"/>
-          <w:numId w:val="4"/>
+          <w:numId w:val="7"/>
         </w:numPr>
         <w:spacing w:after="60"/>
       </w:pPr>
@@ -5684,7 +7631,7 @@
         <w:pStyle w:val="ListParagraph"/>
         <w:numPr>
           <w:ilvl w:val="0"/>
-          <w:numId w:val="4"/>
+          <w:numId w:val="7"/>
         </w:numPr>
         <w:spacing w:after="60"/>
       </w:pPr>
@@ -5719,7 +7666,7 @@
         <w:pStyle w:val="ListParagraph"/>
         <w:numPr>
           <w:ilvl w:val="0"/>
-          <w:numId w:val="4"/>
+          <w:numId w:val="7"/>
         </w:numPr>
         <w:spacing w:after="60"/>
       </w:pPr>
@@ -5738,7 +7685,7 @@
         <w:pStyle w:val="ListParagraph"/>
         <w:numPr>
           <w:ilvl w:val="0"/>
-          <w:numId w:val="4"/>
+          <w:numId w:val="7"/>
         </w:numPr>
         <w:spacing w:after="60"/>
       </w:pPr>
@@ -5773,7 +7720,7 @@
         <w:pStyle w:val="ListParagraph"/>
         <w:numPr>
           <w:ilvl w:val="0"/>
-          <w:numId w:val="4"/>
+          <w:numId w:val="7"/>
         </w:numPr>
         <w:spacing w:after="60"/>
       </w:pPr>
@@ -5792,7 +7739,7 @@
         <w:pStyle w:val="ListParagraph"/>
         <w:numPr>
           <w:ilvl w:val="0"/>
-          <w:numId w:val="4"/>
+          <w:numId w:val="7"/>
         </w:numPr>
         <w:spacing w:after="60"/>
       </w:pPr>
@@ -5811,7 +7758,7 @@
         <w:pStyle w:val="ListParagraph"/>
         <w:numPr>
           <w:ilvl w:val="0"/>
-          <w:numId w:val="4"/>
+          <w:numId w:val="7"/>
         </w:numPr>
         <w:spacing w:after="60"/>
       </w:pPr>
@@ -5830,7 +7777,7 @@
         <w:pStyle w:val="ListParagraph"/>
         <w:numPr>
           <w:ilvl w:val="0"/>
-          <w:numId w:val="4"/>
+          <w:numId w:val="7"/>
         </w:numPr>
         <w:spacing w:after="60"/>
       </w:pPr>
@@ -5860,7 +7807,7 @@
           <w:sz w:val="26"/>
           <w:szCs w:val="26"/>
         </w:rPr>
-        <w:t xml:space="preserve">6. 미확인 항목 (협의 시 확인 필요)</w:t>
+        <w:t xml:space="preserve">7. 미확인 항목 (협의 시 확인 필요)</w:t>
       </w:r>
     </w:p>
     <w:p>
@@ -5868,7 +7815,7 @@
         <w:pStyle w:val="ListParagraph"/>
         <w:numPr>
           <w:ilvl w:val="0"/>
-          <w:numId w:val="5"/>
+          <w:numId w:val="8"/>
         </w:numPr>
         <w:spacing w:after="60"/>
       </w:pPr>
@@ -5885,7 +7832,7 @@
         <w:pStyle w:val="ListParagraph"/>
         <w:numPr>
           <w:ilvl w:val="0"/>
-          <w:numId w:val="5"/>
+          <w:numId w:val="8"/>
         </w:numPr>
         <w:spacing w:after="60"/>
       </w:pPr>
@@ -5902,7 +7849,7 @@
         <w:pStyle w:val="ListParagraph"/>
         <w:numPr>
           <w:ilvl w:val="0"/>
-          <w:numId w:val="5"/>
+          <w:numId w:val="8"/>
         </w:numPr>
         <w:spacing w:after="60"/>
       </w:pPr>
@@ -5919,7 +7866,7 @@
         <w:pStyle w:val="ListParagraph"/>
         <w:numPr>
           <w:ilvl w:val="0"/>
-          <w:numId w:val="5"/>
+          <w:numId w:val="8"/>
         </w:numPr>
         <w:spacing w:after="60"/>
       </w:pPr>
@@ -5936,7 +7883,7 @@
         <w:pStyle w:val="ListParagraph"/>
         <w:numPr>
           <w:ilvl w:val="0"/>
-          <w:numId w:val="5"/>
+          <w:numId w:val="8"/>
         </w:numPr>
         <w:spacing w:after="60"/>
       </w:pPr>
@@ -5953,7 +7900,7 @@
         <w:pStyle w:val="ListParagraph"/>
         <w:numPr>
           <w:ilvl w:val="0"/>
-          <w:numId w:val="5"/>
+          <w:numId w:val="8"/>
         </w:numPr>
         <w:spacing w:after="60"/>
       </w:pPr>
@@ -5970,7 +7917,7 @@
         <w:pStyle w:val="ListParagraph"/>
         <w:numPr>
           <w:ilvl w:val="0"/>
-          <w:numId w:val="5"/>
+          <w:numId w:val="8"/>
         </w:numPr>
         <w:spacing w:after="60"/>
       </w:pPr>
@@ -5987,7 +7934,7 @@
         <w:pStyle w:val="ListParagraph"/>
         <w:numPr>
           <w:ilvl w:val="0"/>
-          <w:numId w:val="5"/>
+          <w:numId w:val="8"/>
         </w:numPr>
         <w:spacing w:after="60"/>
       </w:pPr>
@@ -6015,7 +7962,7 @@
           <w:sz w:val="26"/>
           <w:szCs w:val="26"/>
         </w:rPr>
-        <w:t xml:space="preserve">7. 기술 검토 (DOHO 자체 판단)</w:t>
+        <w:t xml:space="preserve">8. 기술 검토 (DOHO 자체 판단)</w:t>
       </w:r>
     </w:p>
     <w:p>
@@ -6023,7 +7970,7 @@
         <w:pStyle w:val="ListParagraph"/>
         <w:numPr>
           <w:ilvl w:val="0"/>
-          <w:numId w:val="6"/>
+          <w:numId w:val="9"/>
         </w:numPr>
         <w:spacing w:after="60"/>
       </w:pPr>
@@ -6040,7 +7987,7 @@
         <w:pStyle w:val="ListParagraph"/>
         <w:numPr>
           <w:ilvl w:val="0"/>
-          <w:numId w:val="6"/>
+          <w:numId w:val="9"/>
         </w:numPr>
         <w:spacing w:after="60"/>
       </w:pPr>
@@ -6057,7 +8004,7 @@
         <w:pStyle w:val="ListParagraph"/>
         <w:numPr>
           <w:ilvl w:val="0"/>
-          <w:numId w:val="6"/>
+          <w:numId w:val="9"/>
         </w:numPr>
         <w:spacing w:after="60"/>
       </w:pPr>
@@ -6074,7 +8021,7 @@
         <w:pStyle w:val="ListParagraph"/>
         <w:numPr>
           <w:ilvl w:val="0"/>
-          <w:numId w:val="6"/>
+          <w:numId w:val="9"/>
         </w:numPr>
         <w:spacing w:after="60"/>
       </w:pPr>
@@ -6091,7 +8038,7 @@
         <w:pStyle w:val="ListParagraph"/>
         <w:numPr>
           <w:ilvl w:val="0"/>
-          <w:numId w:val="6"/>
+          <w:numId w:val="9"/>
         </w:numPr>
         <w:spacing w:after="60"/>
       </w:pPr>
@@ -6326,6 +8273,42 @@
     </w:lvl>
   </w:abstractNum>
   <w:abstractNum w:abstractNumId="6" w15:restartNumberingAfterBreak="0">
+    <w:multiLevelType w:val="hybridMultilevel"/>
+    <w:lvl w:ilvl="0" w15:tentative="1">
+      <w:start w:val="1"/>
+      <w:numFmt w:val="decimal"/>
+      <w:lvlText w:val="%1."/>
+      <w:lvlJc w:val="start"/>
+      <w:pPr>
+        <w:ind w:left="720" w:hanging="360"/>
+      </w:pPr>
+    </w:lvl>
+  </w:abstractNum>
+  <w:abstractNum w:abstractNumId="7" w15:restartNumberingAfterBreak="0">
+    <w:multiLevelType w:val="hybridMultilevel"/>
+    <w:lvl w:ilvl="0" w15:tentative="1">
+      <w:start w:val="1"/>
+      <w:numFmt w:val="decimal"/>
+      <w:lvlText w:val="%1."/>
+      <w:lvlJc w:val="start"/>
+      <w:pPr>
+        <w:ind w:left="720" w:hanging="360"/>
+      </w:pPr>
+    </w:lvl>
+  </w:abstractNum>
+  <w:abstractNum w:abstractNumId="8" w15:restartNumberingAfterBreak="0">
+    <w:multiLevelType w:val="hybridMultilevel"/>
+    <w:lvl w:ilvl="0" w15:tentative="1">
+      <w:start w:val="1"/>
+      <w:numFmt w:val="decimal"/>
+      <w:lvlText w:val="%1."/>
+      <w:lvlJc w:val="start"/>
+      <w:pPr>
+        <w:ind w:left="720" w:hanging="360"/>
+      </w:pPr>
+    </w:lvl>
+  </w:abstractNum>
+  <w:abstractNum w:abstractNumId="9" w15:restartNumberingAfterBreak="0">
     <w:multiLevelType w:val="hybridMultilevel"/>
     <w:lvl w:ilvl="0" w15:tentative="1">
       <w:start w:val="1"/>
@@ -6356,18 +8339,36 @@
     </w:lvlOverride>
   </w:num>
   <w:num w:numId="4">
+    <w:abstractNumId w:val="7"/>
+    <w:lvlOverride w:ilvl="0">
+      <w:startOverride w:val="1"/>
+    </w:lvlOverride>
+  </w:num>
+  <w:num w:numId="5">
+    <w:abstractNumId w:val="8"/>
+    <w:lvlOverride w:ilvl="0">
+      <w:startOverride w:val="1"/>
+    </w:lvlOverride>
+  </w:num>
+  <w:num w:numId="6">
+    <w:abstractNumId w:val="9"/>
+    <w:lvlOverride w:ilvl="0">
+      <w:startOverride w:val="1"/>
+    </w:lvlOverride>
+  </w:num>
+  <w:num w:numId="7">
     <w:abstractNumId w:val="2"/>
     <w:lvlOverride w:ilvl="0">
       <w:startOverride w:val="1"/>
     </w:lvlOverride>
   </w:num>
-  <w:num w:numId="5">
+  <w:num w:numId="8">
     <w:abstractNumId w:val="4"/>
     <w:lvlOverride w:ilvl="0">
       <w:startOverride w:val="1"/>
     </w:lvlOverride>
   </w:num>
-  <w:num w:numId="6">
+  <w:num w:numId="9">
     <w:abstractNumId w:val="5"/>
     <w:lvlOverride w:ilvl="0">
       <w:startOverride w:val="1"/>

</xml_diff>

<commit_message>
Review the mill test certificate received from the supplier
Chemistry and mechanical results conform to 6061-T6, but the MTC covers
a 450x30x800 lot rather than our 3,000 mm sizes, cites GB/T 3190
(composition only) instead of a tube product standard, leaves
straightness and bend tests blank, has no roundness field at all, and
carries neither inspector signature nor company seal.

Records the re-issue requirements and notes that naming GB/T 6893
(cold drawn) versus GB/T 4437.1 (hot extruded) would reveal the actual
production process.

Co-Authored-By: Claude Opus 5 <noreply@anthropic.com>
Claude-Session: https://claude.ai/code/session_01D8V4YsNDSgybhuKSqPBmt4
</commit_message>
<xml_diff>
--- a/docs/shandong-botong/Botong_Supplier_Dossier.docx
+++ b/docs/shandong-botong/Botong_Supplier_Dossier.docx
@@ -2067,7 +2067,7 @@
                 <w:sz w:val="19"/>
                 <w:szCs w:val="19"/>
               </w:rPr>
-              <w:t xml:space="preserve">Lawrence로부터 자료 수령 — 사업자등록증, ISO 9001, SGS Gold Plus, CE(RoHS) 증서, 견적서 2건, 박사후 실천기지 현판 사진 (유효성 점검 결과 5항 참조)</w:t>
+              <w:t xml:space="preserve">Lawrence로부터 자료 수령 — 사업자등록증, ISO 9001, SGS Gold Plus, CE(RoHS) 증서, 견적서 2건, 박사후 실천기지 현판 사진, MTC 1건 (유효성 점검 결과 5항 참조)</w:t>
             </w:r>
           </w:p>
         </w:tc>
@@ -6708,6 +6708,112 @@
           </w:p>
         </w:tc>
       </w:tr>
+      <w:tr>
+        <w:tc>
+          <w:tcPr>
+            <w:tcW w:type="dxa" w:w="2600"/>
+            <w:tcMar>
+              <w:top w:type="dxa" w:w="60"/>
+              <w:left w:type="dxa" w:w="100"/>
+              <w:bottom w:type="dxa" w:w="60"/>
+              <w:right w:type="dxa" w:w="100"/>
+            </w:tcMar>
+            <w:vAlign w:val="center"/>
+          </w:tcPr>
+          <w:p>
+            <w:pPr>
+              <w:spacing w:after="0"/>
+            </w:pPr>
+            <w:r>
+              <w:rPr>
+                <w:b w:val="false"/>
+                <w:bCs w:val="false"/>
+                <w:sz w:val="19"/>
+                <w:szCs w:val="19"/>
+              </w:rPr>
+              <w:t xml:space="preserve">MTC (材料质量证明书)</w:t>
+            </w:r>
+          </w:p>
+        </w:tc>
+        <w:tc>
+          <w:tcPr>
+            <w:tcW w:type="dxa" w:w="2000"/>
+            <w:tcMar>
+              <w:top w:type="dxa" w:w="60"/>
+              <w:left w:type="dxa" w:w="100"/>
+              <w:bottom w:type="dxa" w:w="60"/>
+              <w:right w:type="dxa" w:w="100"/>
+            </w:tcMar>
+            <w:vAlign w:val="center"/>
+          </w:tcPr>
+          <w:p>
+            <w:pPr>
+              <w:spacing w:after="0"/>
+            </w:pPr>
+            <w:r>
+              <w:rPr>
+                <w:b w:val="false"/>
+                <w:bCs w:val="false"/>
+                <w:sz w:val="19"/>
+                <w:szCs w:val="19"/>
+              </w:rPr>
+              <w:t xml:space="preserve">로트 XK-000-2026-01-16-0011</w:t>
+            </w:r>
+          </w:p>
+        </w:tc>
+        <w:tc>
+          <w:tcPr>
+            <w:tcW w:type="dxa" w:w="1600"/>
+            <w:tcMar>
+              <w:top w:type="dxa" w:w="60"/>
+              <w:left w:type="dxa" w:w="100"/>
+              <w:bottom w:type="dxa" w:w="60"/>
+              <w:right w:type="dxa" w:w="100"/>
+            </w:tcMar>
+            <w:vAlign w:val="center"/>
+          </w:tcPr>
+          <w:p>
+            <w:pPr>
+              <w:spacing w:after="0"/>
+            </w:pPr>
+            <w:r>
+              <w:rPr>
+                <w:b w:val="false"/>
+                <w:bCs w:val="false"/>
+                <w:sz w:val="19"/>
+                <w:szCs w:val="19"/>
+              </w:rPr>
+              <w:t xml:space="preserve">검사 2026-03-11</w:t>
+            </w:r>
+          </w:p>
+        </w:tc>
+        <w:tc>
+          <w:tcPr>
+            <w:tcW w:type="dxa" w:w="3106"/>
+            <w:tcMar>
+              <w:top w:type="dxa" w:w="60"/>
+              <w:left w:type="dxa" w:w="100"/>
+              <w:bottom w:type="dxa" w:w="60"/>
+              <w:right w:type="dxa" w:w="100"/>
+            </w:tcMar>
+            <w:vAlign w:val="center"/>
+          </w:tcPr>
+          <w:p>
+            <w:pPr>
+              <w:spacing w:after="0"/>
+            </w:pPr>
+            <w:r>
+              <w:rPr>
+                <w:b w:val="false"/>
+                <w:bCs w:val="false"/>
+                <w:sz w:val="19"/>
+                <w:szCs w:val="19"/>
+              </w:rPr>
+              <w:t xml:space="preserve">450×30×800 로트 성적서 — 당사 3,000mm 발주에 사용 불가 (5-4)</w:t>
+            </w:r>
+          </w:p>
+        </w:tc>
+      </w:tr>
     </w:tbl>
     <w:p>
       <w:pPr>
@@ -7329,7 +7435,7 @@
           <w:sz w:val="22"/>
           <w:szCs w:val="22"/>
         </w:rPr>
-        <w:t xml:space="preserve">5-4. 아직 미수령 자료</w:t>
+        <w:t xml:space="preserve">5-4. MTC(材料质量证明书) 검토 — 유효기간 문제는 없으나 당사 발주에 사용 불가</w:t>
       </w:r>
     </w:p>
     <w:p>
@@ -7343,42 +7449,1165 @@
           <w:sz w:val="20"/>
           <w:szCs w:val="20"/>
         </w:rPr>
-        <w:t xml:space="preserve">MTC(재질증명서), 치수·진원도 검사성적서, 영문 회사소개서, 수출자격 증빙(대외무역경영자 등록), 은행 계좌 정보, 수출품 품질허가증, 공장·설비 사진 — 전부 미수령.</w:t>
-      </w:r>
-    </w:p>
-    <w:p>
-      <w:pPr>
-        <w:pStyle w:val="Heading1"/>
-        <w:pBdr>
-          <w:bottom w:val="single" w:color="5A9A96" w:sz="4"/>
-        </w:pBdr>
-        <w:spacing w:after="140" w:before="340"/>
+        <w:t xml:space="preserve">수령한 MTC는 로트 XK-000-2026-01-16-0011 / 검사일 2026-03-11의 과거 성적서로 인증서와 같은 만료 개념은 없음. 다만 아래 사유로 당사 발주 건의 품질 근거로는 사용할 수 없음.</w:t>
+      </w:r>
+    </w:p>
+    <w:tbl>
+      <w:tblPr>
+        <w:tblW w:type="dxa" w:w="9306"/>
+        <w:tblBorders>
+          <w:top w:val="single" w:color="auto" w:sz="4"/>
+          <w:left w:val="single" w:color="auto" w:sz="4"/>
+          <w:bottom w:val="single" w:color="auto" w:sz="4"/>
+          <w:right w:val="single" w:color="auto" w:sz="4"/>
+          <w:insideH w:val="single" w:color="auto" w:sz="4"/>
+          <w:insideV w:val="single" w:color="auto" w:sz="4"/>
+        </w:tblBorders>
+      </w:tblPr>
+      <w:tblGrid>
+        <w:gridCol w:w="2600"/>
+        <w:gridCol w:w="3400"/>
+        <w:gridCol w:w="3306"/>
+      </w:tblGrid>
+      <w:tr>
+        <w:tc>
+          <w:tcPr>
+            <w:tcW w:type="dxa" w:w="2600"/>
+            <w:shd w:fill="E4EEF1" w:val="clear"/>
+            <w:tcMar>
+              <w:top w:type="dxa" w:w="60"/>
+              <w:left w:type="dxa" w:w="100"/>
+              <w:bottom w:type="dxa" w:w="60"/>
+              <w:right w:type="dxa" w:w="100"/>
+            </w:tcMar>
+            <w:vAlign w:val="center"/>
+          </w:tcPr>
+          <w:p>
+            <w:pPr>
+              <w:spacing w:after="0"/>
+            </w:pPr>
+            <w:r>
+              <w:rPr>
+                <w:b/>
+                <w:bCs/>
+                <w:color w:val="2E5878"/>
+                <w:sz w:val="19"/>
+                <w:szCs w:val="19"/>
+              </w:rPr>
+              <w:t xml:space="preserve">항목</w:t>
+            </w:r>
+          </w:p>
+        </w:tc>
+        <w:tc>
+          <w:tcPr>
+            <w:tcW w:type="dxa" w:w="3400"/>
+            <w:shd w:fill="E4EEF1" w:val="clear"/>
+            <w:tcMar>
+              <w:top w:type="dxa" w:w="60"/>
+              <w:left w:type="dxa" w:w="100"/>
+              <w:bottom w:type="dxa" w:w="60"/>
+              <w:right w:type="dxa" w:w="100"/>
+            </w:tcMar>
+            <w:vAlign w:val="center"/>
+          </w:tcPr>
+          <w:p>
+            <w:pPr>
+              <w:spacing w:after="0"/>
+            </w:pPr>
+            <w:r>
+              <w:rPr>
+                <w:b/>
+                <w:bCs/>
+                <w:color w:val="2E5878"/>
+                <w:sz w:val="19"/>
+                <w:szCs w:val="19"/>
+              </w:rPr>
+              <w:t xml:space="preserve">기재 내용</w:t>
+            </w:r>
+          </w:p>
+        </w:tc>
+        <w:tc>
+          <w:tcPr>
+            <w:tcW w:type="dxa" w:w="3306"/>
+            <w:shd w:fill="E4EEF1" w:val="clear"/>
+            <w:tcMar>
+              <w:top w:type="dxa" w:w="60"/>
+              <w:left w:type="dxa" w:w="100"/>
+              <w:bottom w:type="dxa" w:w="60"/>
+              <w:right w:type="dxa" w:w="100"/>
+            </w:tcMar>
+            <w:vAlign w:val="center"/>
+          </w:tcPr>
+          <w:p>
+            <w:pPr>
+              <w:spacing w:after="0"/>
+            </w:pPr>
+            <w:r>
+              <w:rPr>
+                <w:b/>
+                <w:bCs/>
+                <w:color w:val="2E5878"/>
+                <w:sz w:val="19"/>
+                <w:szCs w:val="19"/>
+              </w:rPr>
+              <w:t xml:space="preserve">판정</w:t>
+            </w:r>
+          </w:p>
+        </w:tc>
+      </w:tr>
+      <w:tr>
+        <w:tc>
+          <w:tcPr>
+            <w:tcW w:type="dxa" w:w="2600"/>
+            <w:tcMar>
+              <w:top w:type="dxa" w:w="60"/>
+              <w:left w:type="dxa" w:w="100"/>
+              <w:bottom w:type="dxa" w:w="60"/>
+              <w:right w:type="dxa" w:w="100"/>
+            </w:tcMar>
+            <w:vAlign w:val="center"/>
+          </w:tcPr>
+          <w:p>
+            <w:pPr>
+              <w:spacing w:after="0"/>
+            </w:pPr>
+            <w:r>
+              <w:rPr>
+                <w:b w:val="false"/>
+                <w:bCs w:val="false"/>
+                <w:sz w:val="19"/>
+                <w:szCs w:val="19"/>
+              </w:rPr>
+              <w:t xml:space="preserve">규격 (Specification)</w:t>
+            </w:r>
+          </w:p>
+        </w:tc>
+        <w:tc>
+          <w:tcPr>
+            <w:tcW w:type="dxa" w:w="3400"/>
+            <w:tcMar>
+              <w:top w:type="dxa" w:w="60"/>
+              <w:left w:type="dxa" w:w="100"/>
+              <w:bottom w:type="dxa" w:w="60"/>
+              <w:right w:type="dxa" w:w="100"/>
+            </w:tcMar>
+            <w:vAlign w:val="center"/>
+          </w:tcPr>
+          <w:p>
+            <w:pPr>
+              <w:spacing w:after="0"/>
+            </w:pPr>
+            <w:r>
+              <w:rPr>
+                <w:b w:val="false"/>
+                <w:bCs w:val="false"/>
+                <w:sz w:val="19"/>
+                <w:szCs w:val="19"/>
+              </w:rPr>
+              <w:t xml:space="preserve">450 × 30 × 800, 수량 200 pcs</w:t>
+            </w:r>
+          </w:p>
+        </w:tc>
+        <w:tc>
+          <w:tcPr>
+            <w:tcW w:type="dxa" w:w="3306"/>
+            <w:tcMar>
+              <w:top w:type="dxa" w:w="60"/>
+              <w:left w:type="dxa" w:w="100"/>
+              <w:bottom w:type="dxa" w:w="60"/>
+              <w:right w:type="dxa" w:w="100"/>
+            </w:tcMar>
+            <w:vAlign w:val="center"/>
+          </w:tcPr>
+          <w:p>
+            <w:pPr>
+              <w:spacing w:after="0"/>
+            </w:pPr>
+            <w:r>
+              <w:rPr>
+                <w:b w:val="false"/>
+                <w:bCs w:val="false"/>
+                <w:sz w:val="19"/>
+                <w:szCs w:val="19"/>
+              </w:rPr>
+              <w:t xml:space="preserve">당사 요구는 3,000mm — 다른 제품 성적서</w:t>
+            </w:r>
+          </w:p>
+        </w:tc>
+      </w:tr>
+      <w:tr>
+        <w:tc>
+          <w:tcPr>
+            <w:tcW w:type="dxa" w:w="2600"/>
+            <w:tcMar>
+              <w:top w:type="dxa" w:w="60"/>
+              <w:left w:type="dxa" w:w="100"/>
+              <w:bottom w:type="dxa" w:w="60"/>
+              <w:right w:type="dxa" w:w="100"/>
+            </w:tcMar>
+            <w:vAlign w:val="center"/>
+          </w:tcPr>
+          <w:p>
+            <w:pPr>
+              <w:spacing w:after="0"/>
+            </w:pPr>
+            <w:r>
+              <w:rPr>
+                <w:b w:val="false"/>
+                <w:bCs w:val="false"/>
+                <w:sz w:val="19"/>
+                <w:szCs w:val="19"/>
+              </w:rPr>
+              <w:t xml:space="preserve">적용 표준</w:t>
+            </w:r>
+          </w:p>
+        </w:tc>
+        <w:tc>
+          <w:tcPr>
+            <w:tcW w:type="dxa" w:w="3400"/>
+            <w:tcMar>
+              <w:top w:type="dxa" w:w="60"/>
+              <w:left w:type="dxa" w:w="100"/>
+              <w:bottom w:type="dxa" w:w="60"/>
+              <w:right w:type="dxa" w:w="100"/>
+            </w:tcMar>
+            <w:vAlign w:val="center"/>
+          </w:tcPr>
+          <w:p>
+            <w:pPr>
+              <w:spacing w:after="0"/>
+            </w:pPr>
+            <w:r>
+              <w:rPr>
+                <w:b w:val="false"/>
+                <w:bCs w:val="false"/>
+                <w:sz w:val="19"/>
+                <w:szCs w:val="19"/>
+              </w:rPr>
+              <w:t xml:space="preserve">GB/T 3190-2020</w:t>
+            </w:r>
+          </w:p>
+        </w:tc>
+        <w:tc>
+          <w:tcPr>
+            <w:tcW w:type="dxa" w:w="3306"/>
+            <w:tcMar>
+              <w:top w:type="dxa" w:w="60"/>
+              <w:left w:type="dxa" w:w="100"/>
+              <w:bottom w:type="dxa" w:w="60"/>
+              <w:right w:type="dxa" w:w="100"/>
+            </w:tcMar>
+            <w:vAlign w:val="center"/>
+          </w:tcPr>
+          <w:p>
+            <w:pPr>
+              <w:spacing w:after="0"/>
+            </w:pPr>
+            <w:r>
+              <w:rPr>
+                <w:b w:val="false"/>
+                <w:bCs w:val="false"/>
+                <w:sz w:val="19"/>
+                <w:szCs w:val="19"/>
+              </w:rPr>
+              <w:t xml:space="preserve">화학성분 표준일 뿐 관재 제품 표준 아님</w:t>
+            </w:r>
+          </w:p>
+        </w:tc>
+      </w:tr>
+      <w:tr>
+        <w:tc>
+          <w:tcPr>
+            <w:tcW w:type="dxa" w:w="2600"/>
+            <w:tcMar>
+              <w:top w:type="dxa" w:w="60"/>
+              <w:left w:type="dxa" w:w="100"/>
+              <w:bottom w:type="dxa" w:w="60"/>
+              <w:right w:type="dxa" w:w="100"/>
+            </w:tcMar>
+            <w:vAlign w:val="center"/>
+          </w:tcPr>
+          <w:p>
+            <w:pPr>
+              <w:spacing w:after="0"/>
+            </w:pPr>
+            <w:r>
+              <w:rPr>
+                <w:b w:val="false"/>
+                <w:bCs w:val="false"/>
+                <w:sz w:val="19"/>
+                <w:szCs w:val="19"/>
+              </w:rPr>
+              <w:t xml:space="preserve">화학성분</w:t>
+            </w:r>
+          </w:p>
+        </w:tc>
+        <w:tc>
+          <w:tcPr>
+            <w:tcW w:type="dxa" w:w="3400"/>
+            <w:tcMar>
+              <w:top w:type="dxa" w:w="60"/>
+              <w:left w:type="dxa" w:w="100"/>
+              <w:bottom w:type="dxa" w:w="60"/>
+              <w:right w:type="dxa" w:w="100"/>
+            </w:tcMar>
+            <w:vAlign w:val="center"/>
+          </w:tcPr>
+          <w:p>
+            <w:pPr>
+              <w:spacing w:after="0"/>
+            </w:pPr>
+            <w:r>
+              <w:rPr>
+                <w:b w:val="false"/>
+                <w:bCs w:val="false"/>
+                <w:sz w:val="19"/>
+                <w:szCs w:val="19"/>
+              </w:rPr>
+              <w:t xml:space="preserve">Si 0.595 / Fe 0.235 / Cu 0.245 / Mn 0.091 / Mg 0.968 / Cr 0.105 / Ti 0.001 / Zn 0.085</w:t>
+            </w:r>
+          </w:p>
+        </w:tc>
+        <w:tc>
+          <w:tcPr>
+            <w:tcW w:type="dxa" w:w="3306"/>
+            <w:tcMar>
+              <w:top w:type="dxa" w:w="60"/>
+              <w:left w:type="dxa" w:w="100"/>
+              <w:bottom w:type="dxa" w:w="60"/>
+              <w:right w:type="dxa" w:w="100"/>
+            </w:tcMar>
+            <w:vAlign w:val="center"/>
+          </w:tcPr>
+          <w:p>
+            <w:pPr>
+              <w:spacing w:after="0"/>
+            </w:pPr>
+            <w:r>
+              <w:rPr>
+                <w:b w:val="false"/>
+                <w:bCs w:val="false"/>
+                <w:sz w:val="19"/>
+                <w:szCs w:val="19"/>
+              </w:rPr>
+              <w:t xml:space="preserve">전 항목 6061 규격 내 — 합격</w:t>
+            </w:r>
+          </w:p>
+        </w:tc>
+      </w:tr>
+      <w:tr>
+        <w:tc>
+          <w:tcPr>
+            <w:tcW w:type="dxa" w:w="2600"/>
+            <w:tcMar>
+              <w:top w:type="dxa" w:w="60"/>
+              <w:left w:type="dxa" w:w="100"/>
+              <w:bottom w:type="dxa" w:w="60"/>
+              <w:right w:type="dxa" w:w="100"/>
+            </w:tcMar>
+            <w:vAlign w:val="center"/>
+          </w:tcPr>
+          <w:p>
+            <w:pPr>
+              <w:spacing w:after="0"/>
+            </w:pPr>
+            <w:r>
+              <w:rPr>
+                <w:b w:val="false"/>
+                <w:bCs w:val="false"/>
+                <w:sz w:val="19"/>
+                <w:szCs w:val="19"/>
+              </w:rPr>
+              <w:t xml:space="preserve">인장강도</w:t>
+            </w:r>
+          </w:p>
+        </w:tc>
+        <w:tc>
+          <w:tcPr>
+            <w:tcW w:type="dxa" w:w="3400"/>
+            <w:tcMar>
+              <w:top w:type="dxa" w:w="60"/>
+              <w:left w:type="dxa" w:w="100"/>
+              <w:bottom w:type="dxa" w:w="60"/>
+              <w:right w:type="dxa" w:w="100"/>
+            </w:tcMar>
+            <w:vAlign w:val="center"/>
+          </w:tcPr>
+          <w:p>
+            <w:pPr>
+              <w:spacing w:after="0"/>
+            </w:pPr>
+            <w:r>
+              <w:rPr>
+                <w:b w:val="false"/>
+                <w:bCs w:val="false"/>
+                <w:sz w:val="19"/>
+                <w:szCs w:val="19"/>
+              </w:rPr>
+              <w:t xml:space="preserve">요구 ≥310 → 실측 322 MPa</w:t>
+            </w:r>
+          </w:p>
+        </w:tc>
+        <w:tc>
+          <w:tcPr>
+            <w:tcW w:type="dxa" w:w="3306"/>
+            <w:tcMar>
+              <w:top w:type="dxa" w:w="60"/>
+              <w:left w:type="dxa" w:w="100"/>
+              <w:bottom w:type="dxa" w:w="60"/>
+              <w:right w:type="dxa" w:w="100"/>
+            </w:tcMar>
+            <w:vAlign w:val="center"/>
+          </w:tcPr>
+          <w:p>
+            <w:pPr>
+              <w:spacing w:after="0"/>
+            </w:pPr>
+            <w:r>
+              <w:rPr>
+                <w:b w:val="false"/>
+                <w:bCs w:val="false"/>
+                <w:sz w:val="19"/>
+                <w:szCs w:val="19"/>
+              </w:rPr>
+              <w:t xml:space="preserve">합격</w:t>
+            </w:r>
+          </w:p>
+        </w:tc>
+      </w:tr>
+      <w:tr>
+        <w:tc>
+          <w:tcPr>
+            <w:tcW w:type="dxa" w:w="2600"/>
+            <w:tcMar>
+              <w:top w:type="dxa" w:w="60"/>
+              <w:left w:type="dxa" w:w="100"/>
+              <w:bottom w:type="dxa" w:w="60"/>
+              <w:right w:type="dxa" w:w="100"/>
+            </w:tcMar>
+            <w:vAlign w:val="center"/>
+          </w:tcPr>
+          <w:p>
+            <w:pPr>
+              <w:spacing w:after="0"/>
+            </w:pPr>
+            <w:r>
+              <w:rPr>
+                <w:b w:val="false"/>
+                <w:bCs w:val="false"/>
+                <w:sz w:val="19"/>
+                <w:szCs w:val="19"/>
+              </w:rPr>
+              <w:t xml:space="preserve">항복강도</w:t>
+            </w:r>
+          </w:p>
+        </w:tc>
+        <w:tc>
+          <w:tcPr>
+            <w:tcW w:type="dxa" w:w="3400"/>
+            <w:tcMar>
+              <w:top w:type="dxa" w:w="60"/>
+              <w:left w:type="dxa" w:w="100"/>
+              <w:bottom w:type="dxa" w:w="60"/>
+              <w:right w:type="dxa" w:w="100"/>
+            </w:tcMar>
+            <w:vAlign w:val="center"/>
+          </w:tcPr>
+          <w:p>
+            <w:pPr>
+              <w:spacing w:after="0"/>
+            </w:pPr>
+            <w:r>
+              <w:rPr>
+                <w:b w:val="false"/>
+                <w:bCs w:val="false"/>
+                <w:sz w:val="19"/>
+                <w:szCs w:val="19"/>
+              </w:rPr>
+              <w:t xml:space="preserve">요구 ≥275 → 실측 281 MPa</w:t>
+            </w:r>
+          </w:p>
+        </w:tc>
+        <w:tc>
+          <w:tcPr>
+            <w:tcW w:type="dxa" w:w="3306"/>
+            <w:tcMar>
+              <w:top w:type="dxa" w:w="60"/>
+              <w:left w:type="dxa" w:w="100"/>
+              <w:bottom w:type="dxa" w:w="60"/>
+              <w:right w:type="dxa" w:w="100"/>
+            </w:tcMar>
+            <w:vAlign w:val="center"/>
+          </w:tcPr>
+          <w:p>
+            <w:pPr>
+              <w:spacing w:after="0"/>
+            </w:pPr>
+            <w:r>
+              <w:rPr>
+                <w:b w:val="false"/>
+                <w:bCs w:val="false"/>
+                <w:sz w:val="19"/>
+                <w:szCs w:val="19"/>
+              </w:rPr>
+              <w:t xml:space="preserve">합격</w:t>
+            </w:r>
+          </w:p>
+        </w:tc>
+      </w:tr>
+      <w:tr>
+        <w:tc>
+          <w:tcPr>
+            <w:tcW w:type="dxa" w:w="2600"/>
+            <w:tcMar>
+              <w:top w:type="dxa" w:w="60"/>
+              <w:left w:type="dxa" w:w="100"/>
+              <w:bottom w:type="dxa" w:w="60"/>
+              <w:right w:type="dxa" w:w="100"/>
+            </w:tcMar>
+            <w:vAlign w:val="center"/>
+          </w:tcPr>
+          <w:p>
+            <w:pPr>
+              <w:spacing w:after="0"/>
+            </w:pPr>
+            <w:r>
+              <w:rPr>
+                <w:b w:val="false"/>
+                <w:bCs w:val="false"/>
+                <w:sz w:val="19"/>
+                <w:szCs w:val="19"/>
+              </w:rPr>
+              <w:t xml:space="preserve">연신율</w:t>
+            </w:r>
+          </w:p>
+        </w:tc>
+        <w:tc>
+          <w:tcPr>
+            <w:tcW w:type="dxa" w:w="3400"/>
+            <w:tcMar>
+              <w:top w:type="dxa" w:w="60"/>
+              <w:left w:type="dxa" w:w="100"/>
+              <w:bottom w:type="dxa" w:w="60"/>
+              <w:right w:type="dxa" w:w="100"/>
+            </w:tcMar>
+            <w:vAlign w:val="center"/>
+          </w:tcPr>
+          <w:p>
+            <w:pPr>
+              <w:spacing w:after="0"/>
+            </w:pPr>
+            <w:r>
+              <w:rPr>
+                <w:b w:val="false"/>
+                <w:bCs w:val="false"/>
+                <w:sz w:val="19"/>
+                <w:szCs w:val="19"/>
+              </w:rPr>
+              <w:t xml:space="preserve">요구 ≥10% → 실측 11.7%</w:t>
+            </w:r>
+          </w:p>
+        </w:tc>
+        <w:tc>
+          <w:tcPr>
+            <w:tcW w:type="dxa" w:w="3306"/>
+            <w:tcMar>
+              <w:top w:type="dxa" w:w="60"/>
+              <w:left w:type="dxa" w:w="100"/>
+              <w:bottom w:type="dxa" w:w="60"/>
+              <w:right w:type="dxa" w:w="100"/>
+            </w:tcMar>
+            <w:vAlign w:val="center"/>
+          </w:tcPr>
+          <w:p>
+            <w:pPr>
+              <w:spacing w:after="0"/>
+            </w:pPr>
+            <w:r>
+              <w:rPr>
+                <w:b w:val="false"/>
+                <w:bCs w:val="false"/>
+                <w:sz w:val="19"/>
+                <w:szCs w:val="19"/>
+              </w:rPr>
+              <w:t xml:space="preserve">합격</w:t>
+            </w:r>
+          </w:p>
+        </w:tc>
+      </w:tr>
+      <w:tr>
+        <w:tc>
+          <w:tcPr>
+            <w:tcW w:type="dxa" w:w="2600"/>
+            <w:tcMar>
+              <w:top w:type="dxa" w:w="60"/>
+              <w:left w:type="dxa" w:w="100"/>
+              <w:bottom w:type="dxa" w:w="60"/>
+              <w:right w:type="dxa" w:w="100"/>
+            </w:tcMar>
+            <w:vAlign w:val="center"/>
+          </w:tcPr>
+          <w:p>
+            <w:pPr>
+              <w:spacing w:after="0"/>
+            </w:pPr>
+            <w:r>
+              <w:rPr>
+                <w:b w:val="false"/>
+                <w:bCs w:val="false"/>
+                <w:sz w:val="19"/>
+                <w:szCs w:val="19"/>
+              </w:rPr>
+              <w:t xml:space="preserve">경도/전도율</w:t>
+            </w:r>
+          </w:p>
+        </w:tc>
+        <w:tc>
+          <w:tcPr>
+            <w:tcW w:type="dxa" w:w="3400"/>
+            <w:tcMar>
+              <w:top w:type="dxa" w:w="60"/>
+              <w:left w:type="dxa" w:w="100"/>
+              <w:bottom w:type="dxa" w:w="60"/>
+              <w:right w:type="dxa" w:w="100"/>
+            </w:tcMar>
+            <w:vAlign w:val="center"/>
+          </w:tcPr>
+          <w:p>
+            <w:pPr>
+              <w:spacing w:after="0"/>
+            </w:pPr>
+            <w:r>
+              <w:rPr>
+                <w:b w:val="false"/>
+                <w:bCs w:val="false"/>
+                <w:sz w:val="19"/>
+                <w:szCs w:val="19"/>
+              </w:rPr>
+              <w:t xml:space="preserve">요구 ≥95 → 실측 105 (6061-T6 통상 경도 95HB대와 부합)</w:t>
+            </w:r>
+          </w:p>
+        </w:tc>
+        <w:tc>
+          <w:tcPr>
+            <w:tcW w:type="dxa" w:w="3306"/>
+            <w:tcMar>
+              <w:top w:type="dxa" w:w="60"/>
+              <w:left w:type="dxa" w:w="100"/>
+              <w:bottom w:type="dxa" w:w="60"/>
+              <w:right w:type="dxa" w:w="100"/>
+            </w:tcMar>
+            <w:vAlign w:val="center"/>
+          </w:tcPr>
+          <w:p>
+            <w:pPr>
+              <w:spacing w:after="0"/>
+            </w:pPr>
+            <w:r>
+              <w:rPr>
+                <w:b w:val="false"/>
+                <w:bCs w:val="false"/>
+                <w:sz w:val="19"/>
+                <w:szCs w:val="19"/>
+              </w:rPr>
+              <w:t xml:space="preserve">항목 귀속 확인 필요</w:t>
+            </w:r>
+          </w:p>
+        </w:tc>
+      </w:tr>
+      <w:tr>
+        <w:tc>
+          <w:tcPr>
+            <w:tcW w:type="dxa" w:w="2600"/>
+            <w:tcMar>
+              <w:top w:type="dxa" w:w="60"/>
+              <w:left w:type="dxa" w:w="100"/>
+              <w:bottom w:type="dxa" w:w="60"/>
+              <w:right w:type="dxa" w:w="100"/>
+            </w:tcMar>
+            <w:vAlign w:val="center"/>
+          </w:tcPr>
+          <w:p>
+            <w:pPr>
+              <w:spacing w:after="0"/>
+            </w:pPr>
+            <w:r>
+              <w:rPr>
+                <w:b w:val="false"/>
+                <w:bCs w:val="false"/>
+                <w:sz w:val="19"/>
+                <w:szCs w:val="19"/>
+              </w:rPr>
+              <w:t xml:space="preserve">弯曲度 (진직도)</w:t>
+            </w:r>
+          </w:p>
+        </w:tc>
+        <w:tc>
+          <w:tcPr>
+            <w:tcW w:type="dxa" w:w="3400"/>
+            <w:tcMar>
+              <w:top w:type="dxa" w:w="60"/>
+              <w:left w:type="dxa" w:w="100"/>
+              <w:bottom w:type="dxa" w:w="60"/>
+              <w:right w:type="dxa" w:w="100"/>
+            </w:tcMar>
+            <w:vAlign w:val="center"/>
+          </w:tcPr>
+          <w:p>
+            <w:pPr>
+              <w:spacing w:after="0"/>
+            </w:pPr>
+            <w:r>
+              <w:rPr>
+                <w:b w:val="false"/>
+                <w:bCs w:val="false"/>
+                <w:sz w:val="19"/>
+                <w:szCs w:val="19"/>
+              </w:rPr>
+              <w:t xml:space="preserve">공란</w:t>
+            </w:r>
+          </w:p>
+        </w:tc>
+        <w:tc>
+          <w:tcPr>
+            <w:tcW w:type="dxa" w:w="3306"/>
+            <w:tcMar>
+              <w:top w:type="dxa" w:w="60"/>
+              <w:left w:type="dxa" w:w="100"/>
+              <w:bottom w:type="dxa" w:w="60"/>
+              <w:right w:type="dxa" w:w="100"/>
+            </w:tcMar>
+            <w:vAlign w:val="center"/>
+          </w:tcPr>
+          <w:p>
+            <w:pPr>
+              <w:spacing w:after="0"/>
+            </w:pPr>
+            <w:r>
+              <w:rPr>
+                <w:b w:val="false"/>
+                <w:bCs w:val="false"/>
+                <w:sz w:val="19"/>
+                <w:szCs w:val="19"/>
+              </w:rPr>
+              <w:t xml:space="preserve">미측정</w:t>
+            </w:r>
+          </w:p>
+        </w:tc>
+      </w:tr>
+      <w:tr>
+        <w:tc>
+          <w:tcPr>
+            <w:tcW w:type="dxa" w:w="2600"/>
+            <w:tcMar>
+              <w:top w:type="dxa" w:w="60"/>
+              <w:left w:type="dxa" w:w="100"/>
+              <w:bottom w:type="dxa" w:w="60"/>
+              <w:right w:type="dxa" w:w="100"/>
+            </w:tcMar>
+            <w:vAlign w:val="center"/>
+          </w:tcPr>
+          <w:p>
+            <w:pPr>
+              <w:spacing w:after="0"/>
+            </w:pPr>
+            <w:r>
+              <w:rPr>
+                <w:b w:val="false"/>
+                <w:bCs w:val="false"/>
+                <w:sz w:val="19"/>
+                <w:szCs w:val="19"/>
+              </w:rPr>
+              <w:t xml:space="preserve">弯曲/压扁试验 (굽힘·편평)</w:t>
+            </w:r>
+          </w:p>
+        </w:tc>
+        <w:tc>
+          <w:tcPr>
+            <w:tcW w:type="dxa" w:w="3400"/>
+            <w:tcMar>
+              <w:top w:type="dxa" w:w="60"/>
+              <w:left w:type="dxa" w:w="100"/>
+              <w:bottom w:type="dxa" w:w="60"/>
+              <w:right w:type="dxa" w:w="100"/>
+            </w:tcMar>
+            <w:vAlign w:val="center"/>
+          </w:tcPr>
+          <w:p>
+            <w:pPr>
+              <w:spacing w:after="0"/>
+            </w:pPr>
+            <w:r>
+              <w:rPr>
+                <w:b w:val="false"/>
+                <w:bCs w:val="false"/>
+                <w:sz w:val="19"/>
+                <w:szCs w:val="19"/>
+              </w:rPr>
+              <w:t xml:space="preserve">공란</w:t>
+            </w:r>
+          </w:p>
+        </w:tc>
+        <w:tc>
+          <w:tcPr>
+            <w:tcW w:type="dxa" w:w="3306"/>
+            <w:tcMar>
+              <w:top w:type="dxa" w:w="60"/>
+              <w:left w:type="dxa" w:w="100"/>
+              <w:bottom w:type="dxa" w:w="60"/>
+              <w:right w:type="dxa" w:w="100"/>
+            </w:tcMar>
+            <w:vAlign w:val="center"/>
+          </w:tcPr>
+          <w:p>
+            <w:pPr>
+              <w:spacing w:after="0"/>
+            </w:pPr>
+            <w:r>
+              <w:rPr>
+                <w:b w:val="false"/>
+                <w:bCs w:val="false"/>
+                <w:sz w:val="19"/>
+                <w:szCs w:val="19"/>
+              </w:rPr>
+              <w:t xml:space="preserve">미실시</w:t>
+            </w:r>
+          </w:p>
+        </w:tc>
+      </w:tr>
+      <w:tr>
+        <w:tc>
+          <w:tcPr>
+            <w:tcW w:type="dxa" w:w="2600"/>
+            <w:tcMar>
+              <w:top w:type="dxa" w:w="60"/>
+              <w:left w:type="dxa" w:w="100"/>
+              <w:bottom w:type="dxa" w:w="60"/>
+              <w:right w:type="dxa" w:w="100"/>
+            </w:tcMar>
+            <w:vAlign w:val="center"/>
+          </w:tcPr>
+          <w:p>
+            <w:pPr>
+              <w:spacing w:after="0"/>
+            </w:pPr>
+            <w:r>
+              <w:rPr>
+                <w:b w:val="false"/>
+                <w:bCs w:val="false"/>
+                <w:sz w:val="19"/>
+                <w:szCs w:val="19"/>
+              </w:rPr>
+              <w:t xml:space="preserve">진원도 (圆度)</w:t>
+            </w:r>
+          </w:p>
+        </w:tc>
+        <w:tc>
+          <w:tcPr>
+            <w:tcW w:type="dxa" w:w="3400"/>
+            <w:tcMar>
+              <w:top w:type="dxa" w:w="60"/>
+              <w:left w:type="dxa" w:w="100"/>
+              <w:bottom w:type="dxa" w:w="60"/>
+              <w:right w:type="dxa" w:w="100"/>
+            </w:tcMar>
+            <w:vAlign w:val="center"/>
+          </w:tcPr>
+          <w:p>
+            <w:pPr>
+              <w:spacing w:after="0"/>
+            </w:pPr>
+            <w:r>
+              <w:rPr>
+                <w:b w:val="false"/>
+                <w:bCs w:val="false"/>
+                <w:sz w:val="19"/>
+                <w:szCs w:val="19"/>
+              </w:rPr>
+              <w:t xml:space="preserve">항목 자체가 없음</w:t>
+            </w:r>
+          </w:p>
+        </w:tc>
+        <w:tc>
+          <w:tcPr>
+            <w:tcW w:type="dxa" w:w="3306"/>
+            <w:tcMar>
+              <w:top w:type="dxa" w:w="60"/>
+              <w:left w:type="dxa" w:w="100"/>
+              <w:bottom w:type="dxa" w:w="60"/>
+              <w:right w:type="dxa" w:w="100"/>
+            </w:tcMar>
+            <w:vAlign w:val="center"/>
+          </w:tcPr>
+          <w:p>
+            <w:pPr>
+              <w:spacing w:after="0"/>
+            </w:pPr>
+            <w:r>
+              <w:rPr>
+                <w:b w:val="false"/>
+                <w:bCs w:val="false"/>
+                <w:sz w:val="19"/>
+                <w:szCs w:val="19"/>
+              </w:rPr>
+              <w:t xml:space="preserve">당사 필수조건 미대응</w:t>
+            </w:r>
+          </w:p>
+        </w:tc>
+      </w:tr>
+      <w:tr>
+        <w:tc>
+          <w:tcPr>
+            <w:tcW w:type="dxa" w:w="2600"/>
+            <w:tcMar>
+              <w:top w:type="dxa" w:w="60"/>
+              <w:left w:type="dxa" w:w="100"/>
+              <w:bottom w:type="dxa" w:w="60"/>
+              <w:right w:type="dxa" w:w="100"/>
+            </w:tcMar>
+            <w:vAlign w:val="center"/>
+          </w:tcPr>
+          <w:p>
+            <w:pPr>
+              <w:spacing w:after="0"/>
+            </w:pPr>
+            <w:r>
+              <w:rPr>
+                <w:b w:val="false"/>
+                <w:bCs w:val="false"/>
+                <w:sz w:val="19"/>
+                <w:szCs w:val="19"/>
+              </w:rPr>
+              <w:t xml:space="preserve">尺寸检查 (치수검사)</w:t>
+            </w:r>
+          </w:p>
+        </w:tc>
+        <w:tc>
+          <w:tcPr>
+            <w:tcW w:type="dxa" w:w="3400"/>
+            <w:tcMar>
+              <w:top w:type="dxa" w:w="60"/>
+              <w:left w:type="dxa" w:w="100"/>
+              <w:bottom w:type="dxa" w:w="60"/>
+              <w:right w:type="dxa" w:w="100"/>
+            </w:tcMar>
+            <w:vAlign w:val="center"/>
+          </w:tcPr>
+          <w:p>
+            <w:pPr>
+              <w:spacing w:after="0"/>
+            </w:pPr>
+            <w:r>
+              <w:rPr>
+                <w:b w:val="false"/>
+                <w:bCs w:val="false"/>
+                <w:sz w:val="19"/>
+                <w:szCs w:val="19"/>
+              </w:rPr>
+              <w:t xml:space="preserve">"合格"만 기재, 실측값·공차등급 없음</w:t>
+            </w:r>
+          </w:p>
+        </w:tc>
+        <w:tc>
+          <w:tcPr>
+            <w:tcW w:type="dxa" w:w="3306"/>
+            <w:tcMar>
+              <w:top w:type="dxa" w:w="60"/>
+              <w:left w:type="dxa" w:w="100"/>
+              <w:bottom w:type="dxa" w:w="60"/>
+              <w:right w:type="dxa" w:w="100"/>
+            </w:tcMar>
+            <w:vAlign w:val="center"/>
+          </w:tcPr>
+          <w:p>
+            <w:pPr>
+              <w:spacing w:after="0"/>
+            </w:pPr>
+            <w:r>
+              <w:rPr>
+                <w:b w:val="false"/>
+                <w:bCs w:val="false"/>
+                <w:sz w:val="19"/>
+                <w:szCs w:val="19"/>
+              </w:rPr>
+              <w:t xml:space="preserve">검증 불가</w:t>
+            </w:r>
+          </w:p>
+        </w:tc>
+      </w:tr>
+      <w:tr>
+        <w:tc>
+          <w:tcPr>
+            <w:tcW w:type="dxa" w:w="2600"/>
+            <w:tcMar>
+              <w:top w:type="dxa" w:w="60"/>
+              <w:left w:type="dxa" w:w="100"/>
+              <w:bottom w:type="dxa" w:w="60"/>
+              <w:right w:type="dxa" w:w="100"/>
+            </w:tcMar>
+            <w:vAlign w:val="center"/>
+          </w:tcPr>
+          <w:p>
+            <w:pPr>
+              <w:spacing w:after="0"/>
+            </w:pPr>
+            <w:r>
+              <w:rPr>
+                <w:b w:val="false"/>
+                <w:bCs w:val="false"/>
+                <w:sz w:val="19"/>
+                <w:szCs w:val="19"/>
+              </w:rPr>
+              <w:t xml:space="preserve">검사원 서명 / 검측단위 날인</w:t>
+            </w:r>
+          </w:p>
+        </w:tc>
+        <w:tc>
+          <w:tcPr>
+            <w:tcW w:type="dxa" w:w="3400"/>
+            <w:tcMar>
+              <w:top w:type="dxa" w:w="60"/>
+              <w:left w:type="dxa" w:w="100"/>
+              <w:bottom w:type="dxa" w:w="60"/>
+              <w:right w:type="dxa" w:w="100"/>
+            </w:tcMar>
+            <w:vAlign w:val="center"/>
+          </w:tcPr>
+          <w:p>
+            <w:pPr>
+              <w:spacing w:after="0"/>
+            </w:pPr>
+            <w:r>
+              <w:rPr>
+                <w:b w:val="false"/>
+                <w:bCs w:val="false"/>
+                <w:sz w:val="19"/>
+                <w:szCs w:val="19"/>
+              </w:rPr>
+              <w:t xml:space="preserve">모두 공란</w:t>
+            </w:r>
+          </w:p>
+        </w:tc>
+        <w:tc>
+          <w:tcPr>
+            <w:tcW w:type="dxa" w:w="3306"/>
+            <w:tcMar>
+              <w:top w:type="dxa" w:w="60"/>
+              <w:left w:type="dxa" w:w="100"/>
+              <w:bottom w:type="dxa" w:w="60"/>
+              <w:right w:type="dxa" w:w="100"/>
+            </w:tcMar>
+            <w:vAlign w:val="center"/>
+          </w:tcPr>
+          <w:p>
+            <w:pPr>
+              <w:spacing w:after="0"/>
+            </w:pPr>
+            <w:r>
+              <w:rPr>
+                <w:b w:val="false"/>
+                <w:bCs w:val="false"/>
+                <w:sz w:val="19"/>
+                <w:szCs w:val="19"/>
+              </w:rPr>
+              <w:t xml:space="preserve">미서명·무날인 = 공식 문서로 효력 없음</w:t>
+            </w:r>
+          </w:p>
+        </w:tc>
+      </w:tr>
+      <w:tr>
+        <w:tc>
+          <w:tcPr>
+            <w:tcW w:type="dxa" w:w="2600"/>
+            <w:tcMar>
+              <w:top w:type="dxa" w:w="60"/>
+              <w:left w:type="dxa" w:w="100"/>
+              <w:bottom w:type="dxa" w:w="60"/>
+              <w:right w:type="dxa" w:w="100"/>
+            </w:tcMar>
+            <w:vAlign w:val="center"/>
+          </w:tcPr>
+          <w:p>
+            <w:pPr>
+              <w:spacing w:after="0"/>
+            </w:pPr>
+            <w:r>
+              <w:rPr>
+                <w:b w:val="false"/>
+                <w:bCs w:val="false"/>
+                <w:sz w:val="19"/>
+                <w:szCs w:val="19"/>
+              </w:rPr>
+              <w:t xml:space="preserve">订货单位 (발주처)</w:t>
+            </w:r>
+          </w:p>
+        </w:tc>
+        <w:tc>
+          <w:tcPr>
+            <w:tcW w:type="dxa" w:w="3400"/>
+            <w:tcMar>
+              <w:top w:type="dxa" w:w="60"/>
+              <w:left w:type="dxa" w:w="100"/>
+              <w:bottom w:type="dxa" w:w="60"/>
+              <w:right w:type="dxa" w:w="100"/>
+            </w:tcMar>
+            <w:vAlign w:val="center"/>
+          </w:tcPr>
+          <w:p>
+            <w:pPr>
+              <w:spacing w:after="0"/>
+            </w:pPr>
+            <w:r>
+              <w:rPr>
+                <w:b w:val="false"/>
+                <w:bCs w:val="false"/>
+                <w:sz w:val="19"/>
+                <w:szCs w:val="19"/>
+              </w:rPr>
+              <w:t xml:space="preserve">공란</w:t>
+            </w:r>
+          </w:p>
+        </w:tc>
+        <w:tc>
+          <w:tcPr>
+            <w:tcW w:type="dxa" w:w="3306"/>
+            <w:tcMar>
+              <w:top w:type="dxa" w:w="60"/>
+              <w:left w:type="dxa" w:w="100"/>
+              <w:bottom w:type="dxa" w:w="60"/>
+              <w:right w:type="dxa" w:w="100"/>
+            </w:tcMar>
+            <w:vAlign w:val="center"/>
+          </w:tcPr>
+          <w:p>
+            <w:pPr>
+              <w:spacing w:after="0"/>
+            </w:pPr>
+            <w:r>
+              <w:rPr>
+                <w:b w:val="false"/>
+                <w:bCs w:val="false"/>
+                <w:sz w:val="19"/>
+                <w:szCs w:val="19"/>
+              </w:rPr>
+              <w:t xml:space="preserve">특정 거래 귀속 없음</w:t>
+            </w:r>
+          </w:p>
+        </w:tc>
+      </w:tr>
+    </w:tbl>
+    <w:p>
+      <w:pPr>
+        <w:spacing w:after="80"/>
       </w:pPr>
       <w:r>
         <w:rPr>
           <w:b/>
           <w:bCs/>
-          <w:color w:val="2E5878"/>
-          <w:sz w:val="26"/>
-          <w:szCs w:val="26"/>
-        </w:rPr>
-        <w:t xml:space="preserve">6. 제이에스텍 / 제이에스엠텍 제출 대비 — Botong 요청 서류 체크리스트</w:t>
-      </w:r>
-    </w:p>
-    <w:p>
-      <w:pPr>
-        <w:pStyle w:val="Heading2"/>
-        <w:spacing w:after="100" w:before="220"/>
-      </w:pPr>
-      <w:r>
-        <w:rPr>
-          <w:b/>
-          <w:bCs/>
-          <w:color w:val="5A9A96"/>
-          <w:sz w:val="22"/>
-          <w:szCs w:val="22"/>
-        </w:rPr>
-        <w:t xml:space="preserve">A. 회사 자료 (거래처 등록·실사 대응)</w:t>
+          <w:sz w:val="20"/>
+          <w:szCs w:val="20"/>
+        </w:rPr>
+        <w:t xml:space="preserve">핵심 문제 — 적용 표준이 잘못 인용됨</w:t>
       </w:r>
     </w:p>
     <w:p>
@@ -7392,12 +8621,10 @@
       </w:pPr>
       <w:r>
         <w:rPr>
-          <w:b w:val="false"/>
-          <w:bCs w:val="false"/>
           <w:sz w:val="20"/>
           <w:szCs w:val="20"/>
         </w:rPr>
-        <w:t xml:space="preserve">사업자등록증(营业执照) 사본 — 통일사회신용코드 포함  ✅ 수령·유효</w:t>
+        <w:t xml:space="preserve">GB/T 3190-2020은 「변형 알루미늄 및 알루미늄합금 화학성분」 표준으로 합금 조성만 규정함. 치수 공차·기계적 성질·검사방법을 규정하는 제품 표준이 아님.</w:t>
       </w:r>
     </w:p>
     <w:p>
@@ -7411,12 +8638,10 @@
       </w:pPr>
       <w:r>
         <w:rPr>
-          <w:b w:val="false"/>
-          <w:bCs w:val="false"/>
           <w:sz w:val="20"/>
           <w:szCs w:val="20"/>
         </w:rPr>
-        <w:t xml:space="preserve">회사소개서 (영문) — 연혁, 조직, 설비 리스트, 생산능력</w:t>
+        <w:t xml:space="preserve">알루미늄 관재의 제품 표준은 공정에 따라 갈림 — GB/T 6893 = 铝及铝合金拉(轧)制无缝管 (냉간인발/압연 무계목관, 당사 요구 공정) / GB/T 4437.1 = 铝及铝合金热挤压管 제1부 무계목 원관 (열간압출).</w:t>
       </w:r>
     </w:p>
     <w:p>
@@ -7430,12 +8655,174 @@
       </w:pPr>
       <w:r>
         <w:rPr>
+          <w:sz w:val="20"/>
+          <w:szCs w:val="20"/>
+        </w:rPr>
+        <w:t xml:space="preserve">즉 Botong이 GB/T 6893과 GB/T 4437.1 중 무엇을 적용하는지 답하면 실제 공정이 그대로 드러남. 협의 시 반드시 서면으로 받을 것. (해외향이면 ASTM B210 = 냉간인발 / B221 = 압출)</w:t>
+      </w:r>
+    </w:p>
+    <w:p>
+      <w:pPr>
+        <w:spacing w:after="80"/>
+      </w:pPr>
+      <w:r>
+        <w:rPr>
+          <w:b/>
+          <w:bCs/>
+          <w:sz w:val="20"/>
+          <w:szCs w:val="20"/>
+        </w:rPr>
+        <w:t xml:space="preserve">요청 사항 (재발행)</w:t>
+      </w:r>
+    </w:p>
+    <w:p>
+      <w:pPr>
+        <w:pStyle w:val="ListParagraph"/>
+        <w:numPr>
+          <w:ilvl w:val="0"/>
+          <w:numId w:val="8"/>
+        </w:numPr>
+        <w:spacing w:after="60"/>
+      </w:pPr>
+      <w:r>
+        <w:rPr>
+          <w:sz w:val="20"/>
+          <w:szCs w:val="20"/>
+        </w:rPr>
+        <w:t xml:space="preserve">당사 발주 규격(450×30×3000, 460×8×3000) 로트에 대한 신규 MTC</w:t>
+      </w:r>
+    </w:p>
+    <w:p>
+      <w:pPr>
+        <w:pStyle w:val="ListParagraph"/>
+        <w:numPr>
+          <w:ilvl w:val="0"/>
+          <w:numId w:val="8"/>
+        </w:numPr>
+        <w:spacing w:after="60"/>
+      </w:pPr>
+      <w:r>
+        <w:rPr>
+          <w:sz w:val="20"/>
+          <w:szCs w:val="20"/>
+        </w:rPr>
+        <w:t xml:space="preserve">적용 제품 표준 명기 — GB/T 6893 / GB/T 4437.1 / ASTM B210 / B221 중 택일</w:t>
+      </w:r>
+    </w:p>
+    <w:p>
+      <w:pPr>
+        <w:pStyle w:val="ListParagraph"/>
+        <w:numPr>
+          <w:ilvl w:val="0"/>
+          <w:numId w:val="8"/>
+        </w:numPr>
+        <w:spacing w:after="60"/>
+      </w:pPr>
+      <w:r>
+        <w:rPr>
+          <w:sz w:val="20"/>
+          <w:szCs w:val="20"/>
+        </w:rPr>
+        <w:t xml:space="preserve">EN 10204 3.1 형식 (제조사 검사책임자 서명 + 사명 날인 필수)</w:t>
+      </w:r>
+    </w:p>
+    <w:p>
+      <w:pPr>
+        <w:pStyle w:val="ListParagraph"/>
+        <w:numPr>
+          <w:ilvl w:val="0"/>
+          <w:numId w:val="8"/>
+        </w:numPr>
+        <w:spacing w:after="60"/>
+      </w:pPr>
+      <w:r>
+        <w:rPr>
+          <w:sz w:val="20"/>
+          <w:szCs w:val="20"/>
+        </w:rPr>
+        <w:t xml:space="preserve">진원도 360° 편차 0.5mm 이내 및 진직도 실측값 기재, 치수는 실측값+공차 기재</w:t>
+      </w:r>
+    </w:p>
+    <w:p>
+      <w:pPr>
+        <w:pStyle w:val="ListParagraph"/>
+        <w:numPr>
+          <w:ilvl w:val="0"/>
+          <w:numId w:val="8"/>
+        </w:numPr>
+        <w:spacing w:after="60"/>
+      </w:pPr>
+      <w:r>
+        <w:rPr>
+          <w:sz w:val="20"/>
+          <w:szCs w:val="20"/>
+        </w:rPr>
+        <w:t xml:space="preserve">T6 열처리 기록 첨부</w:t>
+      </w:r>
+    </w:p>
+    <w:p>
+      <w:pPr>
+        <w:pStyle w:val="Heading2"/>
+        <w:spacing w:after="100" w:before="220"/>
+      </w:pPr>
+      <w:r>
+        <w:rPr>
+          <w:b/>
+          <w:bCs/>
+          <w:color w:val="5A9A96"/>
+          <w:sz w:val="22"/>
+          <w:szCs w:val="22"/>
+        </w:rPr>
+        <w:t xml:space="preserve">5-5. 아직 미수령 자료</w:t>
+      </w:r>
+    </w:p>
+    <w:p>
+      <w:pPr>
+        <w:spacing w:after="80"/>
+      </w:pPr>
+      <w:r>
+        <w:rPr>
           <w:b w:val="false"/>
           <w:bCs w:val="false"/>
           <w:sz w:val="20"/>
           <w:szCs w:val="20"/>
         </w:rPr>
-        <w:t xml:space="preserve">공장·설비 사진 및 생산라인 사양 (압출기 톤수, 인발 설비 유무 포함)</w:t>
+        <w:t xml:space="preserve">당사 규격 기준 MTC(위 5-4 참조), 치수·진원도 검사성적서, 영문 회사소개서, 수출자격 증빙(대외무역경영자 등록), 은행 계좌 정보, 수출품 품질허가증, 공장·설비 사진 — 미수령.</w:t>
+      </w:r>
+    </w:p>
+    <w:p>
+      <w:pPr>
+        <w:pStyle w:val="Heading1"/>
+        <w:pBdr>
+          <w:bottom w:val="single" w:color="5A9A96" w:sz="4"/>
+        </w:pBdr>
+        <w:spacing w:after="140" w:before="340"/>
+      </w:pPr>
+      <w:r>
+        <w:rPr>
+          <w:b/>
+          <w:bCs/>
+          <w:color w:val="2E5878"/>
+          <w:sz w:val="26"/>
+          <w:szCs w:val="26"/>
+        </w:rPr>
+        <w:t xml:space="preserve">6. 제이에스텍 / 제이에스엠텍 제출 대비 — Botong 요청 서류 체크리스트</w:t>
+      </w:r>
+    </w:p>
+    <w:p>
+      <w:pPr>
+        <w:pStyle w:val="Heading2"/>
+        <w:spacing w:after="100" w:before="220"/>
+      </w:pPr>
+      <w:r>
+        <w:rPr>
+          <w:b/>
+          <w:bCs/>
+          <w:color w:val="5A9A96"/>
+          <w:sz w:val="22"/>
+          <w:szCs w:val="22"/>
+        </w:rPr>
+        <w:t xml:space="preserve">A. 회사 자료 (거래처 등록·실사 대응)</w:t>
       </w:r>
     </w:p>
     <w:p>
@@ -7443,7 +8830,7 @@
         <w:pStyle w:val="ListParagraph"/>
         <w:numPr>
           <w:ilvl w:val="0"/>
-          <w:numId w:val="7"/>
+          <w:numId w:val="9"/>
         </w:numPr>
         <w:spacing w:after="60"/>
       </w:pPr>
@@ -7454,7 +8841,7 @@
           <w:sz w:val="20"/>
           <w:szCs w:val="20"/>
         </w:rPr>
-        <w:t xml:space="preserve">수출 자격 증빙 (대외무역경영자 등록 등)</w:t>
+        <w:t xml:space="preserve">사업자등록증(营业执照) 사본 — 통일사회신용코드 포함  ✅ 수령·유효</w:t>
       </w:r>
     </w:p>
     <w:p>
@@ -7462,7 +8849,64 @@
         <w:pStyle w:val="ListParagraph"/>
         <w:numPr>
           <w:ilvl w:val="0"/>
-          <w:numId w:val="7"/>
+          <w:numId w:val="9"/>
+        </w:numPr>
+        <w:spacing w:after="60"/>
+      </w:pPr>
+      <w:r>
+        <w:rPr>
+          <w:b w:val="false"/>
+          <w:bCs w:val="false"/>
+          <w:sz w:val="20"/>
+          <w:szCs w:val="20"/>
+        </w:rPr>
+        <w:t xml:space="preserve">회사소개서 (영문) — 연혁, 조직, 설비 리스트, 생산능력</w:t>
+      </w:r>
+    </w:p>
+    <w:p>
+      <w:pPr>
+        <w:pStyle w:val="ListParagraph"/>
+        <w:numPr>
+          <w:ilvl w:val="0"/>
+          <w:numId w:val="9"/>
+        </w:numPr>
+        <w:spacing w:after="60"/>
+      </w:pPr>
+      <w:r>
+        <w:rPr>
+          <w:b w:val="false"/>
+          <w:bCs w:val="false"/>
+          <w:sz w:val="20"/>
+          <w:szCs w:val="20"/>
+        </w:rPr>
+        <w:t xml:space="preserve">공장·설비 사진 및 생산라인 사양 (압출기 톤수, 인발 설비 유무 포함)</w:t>
+      </w:r>
+    </w:p>
+    <w:p>
+      <w:pPr>
+        <w:pStyle w:val="ListParagraph"/>
+        <w:numPr>
+          <w:ilvl w:val="0"/>
+          <w:numId w:val="9"/>
+        </w:numPr>
+        <w:spacing w:after="60"/>
+      </w:pPr>
+      <w:r>
+        <w:rPr>
+          <w:b w:val="false"/>
+          <w:bCs w:val="false"/>
+          <w:sz w:val="20"/>
+          <w:szCs w:val="20"/>
+        </w:rPr>
+        <w:t xml:space="preserve">수출 자격 증빙 (대외무역경영자 등록 등)</w:t>
+      </w:r>
+    </w:p>
+    <w:p>
+      <w:pPr>
+        <w:pStyle w:val="ListParagraph"/>
+        <w:numPr>
+          <w:ilvl w:val="0"/>
+          <w:numId w:val="9"/>
         </w:numPr>
         <w:spacing w:after="60"/>
       </w:pPr>
@@ -7539,7 +8983,7 @@
         <w:pStyle w:val="ListParagraph"/>
         <w:numPr>
           <w:ilvl w:val="0"/>
-          <w:numId w:val="7"/>
+          <w:numId w:val="9"/>
         </w:numPr>
         <w:spacing w:after="60"/>
       </w:pPr>
@@ -7551,418 +8995,6 @@
           <w:szCs w:val="20"/>
         </w:rPr>
         <w:t xml:space="preserve">ISO 9001:2015 인증서 — 수령분 2025-09-26 만료 → 갱신본 재요청 필요, 발급기관 조회로 유효성 검증</w:t>
-      </w:r>
-    </w:p>
-    <w:p>
-      <w:pPr>
-        <w:pStyle w:val="ListParagraph"/>
-        <w:numPr>
-          <w:ilvl w:val="0"/>
-          <w:numId w:val="7"/>
-        </w:numPr>
-        <w:spacing w:after="60"/>
-      </w:pPr>
-      <w:r>
-        <w:rPr>
-          <w:b w:val="false"/>
-          <w:bCs w:val="false"/>
-          <w:sz w:val="20"/>
-          <w:szCs w:val="20"/>
-        </w:rPr>
-        <w:t xml:space="preserve">CE 인증서 — 수령분은 RoHS 적합성 증서(시료 한정)로 CE 인증서 아님 → 요구 자료 성격 재확인 및 재발행 요청 (5-2 참조)</w:t>
-      </w:r>
-    </w:p>
-    <w:p>
-      <w:pPr>
-        <w:pStyle w:val="ListParagraph"/>
-        <w:numPr>
-          <w:ilvl w:val="0"/>
-          <w:numId w:val="7"/>
-        </w:numPr>
-        <w:spacing w:after="60"/>
-      </w:pPr>
-      <w:r>
-        <w:rPr>
-          <w:b w:val="false"/>
-          <w:bCs w:val="false"/>
-          <w:sz w:val="20"/>
-          <w:szCs w:val="20"/>
-        </w:rPr>
-        <w:t xml:space="preserve">SGS 감사보고서 (Alibaba Gold Plus) — 수령분 2025-10-14 만료 → 재심사본 요청 필요</w:t>
-      </w:r>
-    </w:p>
-    <w:p>
-      <w:pPr>
-        <w:pStyle w:val="ListParagraph"/>
-        <w:numPr>
-          <w:ilvl w:val="0"/>
-          <w:numId w:val="7"/>
-        </w:numPr>
-        <w:spacing w:after="60"/>
-      </w:pPr>
-      <w:r>
-        <w:rPr>
-          <w:b w:val="false"/>
-          <w:bCs w:val="false"/>
-          <w:sz w:val="20"/>
-          <w:szCs w:val="20"/>
-        </w:rPr>
-        <w:t xml:space="preserve">수출품 품질허가증 — 유효기간 확인</w:t>
-      </w:r>
-    </w:p>
-    <w:p>
-      <w:pPr>
-        <w:pStyle w:val="Heading2"/>
-        <w:spacing w:after="100" w:before="220"/>
-      </w:pPr>
-      <w:r>
-        <w:rPr>
-          <w:b/>
-          <w:bCs/>
-          <w:color w:val="5A9A96"/>
-          <w:sz w:val="22"/>
-          <w:szCs w:val="22"/>
-        </w:rPr>
-        <w:t xml:space="preserve">C. 제품 품질 서류 (선적 로트별)</w:t>
-      </w:r>
-    </w:p>
-    <w:p>
-      <w:pPr>
-        <w:pStyle w:val="ListParagraph"/>
-        <w:numPr>
-          <w:ilvl w:val="0"/>
-          <w:numId w:val="7"/>
-        </w:numPr>
-        <w:spacing w:after="60"/>
-      </w:pPr>
-      <w:r>
-        <w:rPr>
-          <w:b w:val="false"/>
-          <w:bCs w:val="false"/>
-          <w:sz w:val="20"/>
-          <w:szCs w:val="20"/>
-        </w:rPr>
-        <w:t xml:space="preserve">MTC (Mill Test Certificate, EN 10204 3.1) — 적용 규격 명시 요청 (ASTM B210/B221 또는 GB/T 상당)</w:t>
-      </w:r>
-    </w:p>
-    <w:p>
-      <w:pPr>
-        <w:spacing w:after="80"/>
-        <w:ind w:left="720"/>
-      </w:pPr>
-      <w:r>
-        <w:rPr>
-          <w:b w:val="false"/>
-          <w:bCs w:val="false"/>
-          <w:color w:val="555555"/>
-          <w:sz w:val="19"/>
-          <w:szCs w:val="19"/>
-        </w:rPr>
-        <w:t xml:space="preserve">· 화학성분 분석 (6061 합금 조성)  · 기계적 성질 (인장·항복·연신율)  · T6 열처리 기록</w:t>
-      </w:r>
-    </w:p>
-    <w:p>
-      <w:pPr>
-        <w:pStyle w:val="ListParagraph"/>
-        <w:numPr>
-          <w:ilvl w:val="0"/>
-          <w:numId w:val="7"/>
-        </w:numPr>
-        <w:spacing w:after="60"/>
-      </w:pPr>
-      <w:r>
-        <w:rPr>
-          <w:b w:val="false"/>
-          <w:bCs w:val="false"/>
-          <w:sz w:val="20"/>
-          <w:szCs w:val="20"/>
-        </w:rPr>
-        <w:t xml:space="preserve">치수·진원도 검사성적서 — 당사 기준(360° 편차 0.5mm 이내, 외경 +0.05/−0.00) 반영</w:t>
-      </w:r>
-    </w:p>
-    <w:p>
-      <w:pPr>
-        <w:pStyle w:val="ListParagraph"/>
-        <w:numPr>
-          <w:ilvl w:val="0"/>
-          <w:numId w:val="7"/>
-        </w:numPr>
-        <w:spacing w:after="60"/>
-      </w:pPr>
-      <w:r>
-        <w:rPr>
-          <w:b w:val="false"/>
-          <w:bCs w:val="false"/>
-          <w:sz w:val="20"/>
-          <w:szCs w:val="20"/>
-        </w:rPr>
-        <w:t xml:space="preserve">단일피스(무용접) 확인 문구</w:t>
-      </w:r>
-    </w:p>
-    <w:p>
-      <w:pPr>
-        <w:pStyle w:val="Heading2"/>
-        <w:spacing w:after="100" w:before="220"/>
-      </w:pPr>
-      <w:r>
-        <w:rPr>
-          <w:b/>
-          <w:bCs/>
-          <w:color w:val="5A9A96"/>
-          <w:sz w:val="22"/>
-          <w:szCs w:val="22"/>
-        </w:rPr>
-        <w:t xml:space="preserve">D. 무역·통관 서류 (면세 적용 필수)</w:t>
-      </w:r>
-    </w:p>
-    <w:p>
-      <w:pPr>
-        <w:pStyle w:val="ListParagraph"/>
-        <w:numPr>
-          <w:ilvl w:val="0"/>
-          <w:numId w:val="7"/>
-        </w:numPr>
-        <w:spacing w:after="60"/>
-      </w:pPr>
-      <w:r>
-        <w:rPr>
-          <w:b/>
-          <w:bCs/>
-          <w:sz w:val="20"/>
-          <w:szCs w:val="20"/>
-        </w:rPr>
-        <w:t xml:space="preserve">한-중 FTA 원산지증명서(C/O) — 중국 세관(海关) 또는 CCPIT 발급 정본, HS 7608.20 기재</w:t>
-      </w:r>
-    </w:p>
-    <w:p>
-      <w:pPr>
-        <w:pStyle w:val="ListParagraph"/>
-        <w:numPr>
-          <w:ilvl w:val="0"/>
-          <w:numId w:val="7"/>
-        </w:numPr>
-        <w:spacing w:after="60"/>
-      </w:pPr>
-      <w:r>
-        <w:rPr>
-          <w:b w:val="false"/>
-          <w:bCs w:val="false"/>
-          <w:sz w:val="20"/>
-          <w:szCs w:val="20"/>
-        </w:rPr>
-        <w:t xml:space="preserve">Commercial Invoice — HS 7608.20 기재</w:t>
-      </w:r>
-    </w:p>
-    <w:p>
-      <w:pPr>
-        <w:pStyle w:val="ListParagraph"/>
-        <w:numPr>
-          <w:ilvl w:val="0"/>
-          <w:numId w:val="7"/>
-        </w:numPr>
-        <w:spacing w:after="60"/>
-      </w:pPr>
-      <w:r>
-        <w:rPr>
-          <w:b w:val="false"/>
-          <w:bCs w:val="false"/>
-          <w:sz w:val="20"/>
-          <w:szCs w:val="20"/>
-        </w:rPr>
-        <w:t xml:space="preserve">Packing List</w:t>
-      </w:r>
-    </w:p>
-    <w:p>
-      <w:pPr>
-        <w:pStyle w:val="ListParagraph"/>
-        <w:numPr>
-          <w:ilvl w:val="0"/>
-          <w:numId w:val="7"/>
-        </w:numPr>
-        <w:spacing w:after="60"/>
-      </w:pPr>
-      <w:r>
-        <w:rPr>
-          <w:b w:val="false"/>
-          <w:bCs w:val="false"/>
-          <w:sz w:val="20"/>
-          <w:szCs w:val="20"/>
-        </w:rPr>
-        <w:t xml:space="preserve">B/L</w:t>
-      </w:r>
-    </w:p>
-    <w:p>
-      <w:pPr>
-        <w:pStyle w:val="Heading1"/>
-        <w:pBdr>
-          <w:bottom w:val="single" w:color="5A9A96" w:sz="4"/>
-        </w:pBdr>
-        <w:spacing w:after="140" w:before="340"/>
-      </w:pPr>
-      <w:r>
-        <w:rPr>
-          <w:b/>
-          <w:bCs/>
-          <w:color w:val="2E5878"/>
-          <w:sz w:val="26"/>
-          <w:szCs w:val="26"/>
-        </w:rPr>
-        <w:t xml:space="preserve">7. 미확인 항목 (협의 시 확인 필요)</w:t>
-      </w:r>
-    </w:p>
-    <w:p>
-      <w:pPr>
-        <w:pStyle w:val="ListParagraph"/>
-        <w:numPr>
-          <w:ilvl w:val="0"/>
-          <w:numId w:val="8"/>
-        </w:numPr>
-        <w:spacing w:after="60"/>
-      </w:pPr>
-      <w:r>
-        <w:rPr>
-          <w:sz w:val="20"/>
-          <w:szCs w:val="20"/>
-        </w:rPr>
-        <w:t xml:space="preserve">실제 생산 공정 (냉간인발 / 열간압출 / 단조)</w:t>
-      </w:r>
-    </w:p>
-    <w:p>
-      <w:pPr>
-        <w:pStyle w:val="ListParagraph"/>
-        <w:numPr>
-          <w:ilvl w:val="0"/>
-          <w:numId w:val="8"/>
-        </w:numPr>
-        <w:spacing w:after="60"/>
-      </w:pPr>
-      <w:r>
-        <w:rPr>
-          <w:sz w:val="20"/>
-          <w:szCs w:val="20"/>
-        </w:rPr>
-        <w:t xml:space="preserve">φ450·φ460 생산 주체 (자사 / 협력사) — C/O 발급 주체와 직결</w:t>
-      </w:r>
-    </w:p>
-    <w:p>
-      <w:pPr>
-        <w:pStyle w:val="ListParagraph"/>
-        <w:numPr>
-          <w:ilvl w:val="0"/>
-          <w:numId w:val="8"/>
-        </w:numPr>
-        <w:spacing w:after="60"/>
-      </w:pPr>
-      <w:r>
-        <w:rPr>
-          <w:sz w:val="20"/>
-          <w:szCs w:val="20"/>
-        </w:rPr>
-        <w:t xml:space="preserve">MTC 적용 규격</w:t>
-      </w:r>
-    </w:p>
-    <w:p>
-      <w:pPr>
-        <w:pStyle w:val="ListParagraph"/>
-        <w:numPr>
-          <w:ilvl w:val="0"/>
-          <w:numId w:val="8"/>
-        </w:numPr>
-        <w:spacing w:after="60"/>
-      </w:pPr>
-      <w:r>
-        <w:rPr>
-          <w:sz w:val="20"/>
-          <w:szCs w:val="20"/>
-        </w:rPr>
-        <w:t xml:space="preserve">규격별 MOQ</w:t>
-      </w:r>
-    </w:p>
-    <w:p>
-      <w:pPr>
-        <w:pStyle w:val="ListParagraph"/>
-        <w:numPr>
-          <w:ilvl w:val="0"/>
-          <w:numId w:val="8"/>
-        </w:numPr>
-        <w:spacing w:after="60"/>
-      </w:pPr>
-      <w:r>
-        <w:rPr>
-          <w:sz w:val="20"/>
-          <w:szCs w:val="20"/>
-        </w:rPr>
-        <w:t xml:space="preserve">재고 보유 여부</w:t>
-      </w:r>
-    </w:p>
-    <w:p>
-      <w:pPr>
-        <w:pStyle w:val="ListParagraph"/>
-        <w:numPr>
-          <w:ilvl w:val="0"/>
-          <w:numId w:val="8"/>
-        </w:numPr>
-        <w:spacing w:after="60"/>
-      </w:pPr>
-      <w:r>
-        <w:rPr>
-          <w:sz w:val="20"/>
-          <w:szCs w:val="20"/>
-        </w:rPr>
-        <w:t xml:space="preserve">공장 방문 가능 여부</w:t>
-      </w:r>
-    </w:p>
-    <w:p>
-      <w:pPr>
-        <w:pStyle w:val="ListParagraph"/>
-        <w:numPr>
-          <w:ilvl w:val="0"/>
-          <w:numId w:val="8"/>
-        </w:numPr>
-        <w:spacing w:after="60"/>
-      </w:pPr>
-      <w:r>
-        <w:rPr>
-          <w:sz w:val="20"/>
-          <w:szCs w:val="20"/>
-        </w:rPr>
-        <w:t xml:space="preserve">Fuchengtai 대비 단가 차이 사유</w:t>
-      </w:r>
-    </w:p>
-    <w:p>
-      <w:pPr>
-        <w:pStyle w:val="ListParagraph"/>
-        <w:numPr>
-          <w:ilvl w:val="0"/>
-          <w:numId w:val="8"/>
-        </w:numPr>
-        <w:spacing w:after="60"/>
-      </w:pPr>
-      <w:r>
-        <w:rPr>
-          <w:sz w:val="20"/>
-          <w:szCs w:val="20"/>
-        </w:rPr>
-        <w:t xml:space="preserve">Group A·B (18개 품목, L2,000mm) 대응 가능 여부 및 견적 — 미논의</w:t>
-      </w:r>
-    </w:p>
-    <w:p>
-      <w:pPr>
-        <w:pStyle w:val="Heading1"/>
-        <w:pBdr>
-          <w:bottom w:val="single" w:color="5A9A96" w:sz="4"/>
-        </w:pBdr>
-        <w:spacing w:after="140" w:before="340"/>
-      </w:pPr>
-      <w:r>
-        <w:rPr>
-          <w:b/>
-          <w:bCs/>
-          <w:color w:val="2E5878"/>
-          <w:sz w:val="26"/>
-          <w:szCs w:val="26"/>
-        </w:rPr>
-        <w:t xml:space="preserve">8. 기술 검토 (DOHO 자체 판단)</w:t>
       </w:r>
     </w:p>
     <w:p>
@@ -7976,10 +9008,12 @@
       </w:pPr>
       <w:r>
         <w:rPr>
+          <w:b w:val="false"/>
+          <w:bCs w:val="false"/>
           <w:sz w:val="20"/>
           <w:szCs w:val="20"/>
         </w:rPr>
-        <w:t xml:space="preserve">Botong 보유 최대 프레스는 2,300톤급 → 빌렛 직경 추정 230~254mm 이하. 당사 규격 φ450·φ460은 약 2배로 자사 압출기 생산 불가로 추정.</w:t>
+        <w:t xml:space="preserve">CE 인증서 — 수령분은 RoHS 적합성 증서(시료 한정)로 CE 인증서 아님 → 요구 자료 성격 재확인 및 재발행 요청 (5-2 참조)</w:t>
       </w:r>
     </w:p>
     <w:p>
@@ -7993,10 +9027,12 @@
       </w:pPr>
       <w:r>
         <w:rPr>
+          <w:b w:val="false"/>
+          <w:bCs w:val="false"/>
           <w:sz w:val="20"/>
           <w:szCs w:val="20"/>
         </w:rPr>
-        <w:t xml:space="preserve">따라서 φ450/φ460 견적가는 외부 조달가일 가능성이 있음.</w:t>
+        <w:t xml:space="preserve">SGS 감사보고서 (Alibaba Gold Plus) — 수령분 2025-10-14 만료 → 재심사본 요청 필요</w:t>
       </w:r>
     </w:p>
     <w:p>
@@ -8010,10 +9046,28 @@
       </w:pPr>
       <w:r>
         <w:rPr>
+          <w:b w:val="false"/>
+          <w:bCs w:val="false"/>
           <w:sz w:val="20"/>
           <w:szCs w:val="20"/>
         </w:rPr>
-        <w:t xml:space="preserve">방문/협의 시 확인: 보유 프레스 실물 톤수와 컨테이너 직경, 당사 규격의 실제 생산 공장.</w:t>
+        <w:t xml:space="preserve">수출품 품질허가증 — 유효기간 확인</w:t>
+      </w:r>
+    </w:p>
+    <w:p>
+      <w:pPr>
+        <w:pStyle w:val="Heading2"/>
+        <w:spacing w:after="100" w:before="220"/>
+      </w:pPr>
+      <w:r>
+        <w:rPr>
+          <w:b/>
+          <w:bCs/>
+          <w:color w:val="5A9A96"/>
+          <w:sz w:val="22"/>
+          <w:szCs w:val="22"/>
+        </w:rPr>
+        <w:t xml:space="preserve">C. 제품 품질 서류 (선적 로트별)</w:t>
       </w:r>
     </w:p>
     <w:p>
@@ -8027,10 +9081,28 @@
       </w:pPr>
       <w:r>
         <w:rPr>
+          <w:b w:val="false"/>
+          <w:bCs w:val="false"/>
           <w:sz w:val="20"/>
           <w:szCs w:val="20"/>
         </w:rPr>
-        <w:t xml:space="preserve">외주 생산으로 확인될 경우: MTC 발행 주체, C/O 발급 가능 여부(HS 7608.20), 품질 책임 소재를 서면으로 정리할 것.</w:t>
+        <w:t xml:space="preserve">MTC (EN 10204 3.1) — 수령분은 450×30×800 로트·GB/T 3190(성분표준) 인용·무날인 → 당사 규격 로트로 재발행 요청 필요 (5-4 참조)</w:t>
+      </w:r>
+    </w:p>
+    <w:p>
+      <w:pPr>
+        <w:spacing w:after="80"/>
+        <w:ind w:left="720"/>
+      </w:pPr>
+      <w:r>
+        <w:rPr>
+          <w:b w:val="false"/>
+          <w:bCs w:val="false"/>
+          <w:color w:val="555555"/>
+          <w:sz w:val="19"/>
+          <w:szCs w:val="19"/>
+        </w:rPr>
+        <w:t xml:space="preserve">· 화학성분 분석 (6061 합금 조성)  · 기계적 성질 (인장·항복·연신율)  · T6 열처리 기록</w:t>
       </w:r>
     </w:p>
     <w:p>
@@ -8039,6 +9111,378 @@
         <w:numPr>
           <w:ilvl w:val="0"/>
           <w:numId w:val="9"/>
+        </w:numPr>
+        <w:spacing w:after="60"/>
+      </w:pPr>
+      <w:r>
+        <w:rPr>
+          <w:b w:val="false"/>
+          <w:bCs w:val="false"/>
+          <w:sz w:val="20"/>
+          <w:szCs w:val="20"/>
+        </w:rPr>
+        <w:t xml:space="preserve">치수·진원도 검사성적서 — 당사 기준(360° 편차 0.5mm 이내, 외경 +0.05/−0.00) 반영</w:t>
+      </w:r>
+    </w:p>
+    <w:p>
+      <w:pPr>
+        <w:pStyle w:val="ListParagraph"/>
+        <w:numPr>
+          <w:ilvl w:val="0"/>
+          <w:numId w:val="9"/>
+        </w:numPr>
+        <w:spacing w:after="60"/>
+      </w:pPr>
+      <w:r>
+        <w:rPr>
+          <w:b w:val="false"/>
+          <w:bCs w:val="false"/>
+          <w:sz w:val="20"/>
+          <w:szCs w:val="20"/>
+        </w:rPr>
+        <w:t xml:space="preserve">단일피스(무용접) 확인 문구</w:t>
+      </w:r>
+    </w:p>
+    <w:p>
+      <w:pPr>
+        <w:pStyle w:val="Heading2"/>
+        <w:spacing w:after="100" w:before="220"/>
+      </w:pPr>
+      <w:r>
+        <w:rPr>
+          <w:b/>
+          <w:bCs/>
+          <w:color w:val="5A9A96"/>
+          <w:sz w:val="22"/>
+          <w:szCs w:val="22"/>
+        </w:rPr>
+        <w:t xml:space="preserve">D. 무역·통관 서류 (면세 적용 필수)</w:t>
+      </w:r>
+    </w:p>
+    <w:p>
+      <w:pPr>
+        <w:pStyle w:val="ListParagraph"/>
+        <w:numPr>
+          <w:ilvl w:val="0"/>
+          <w:numId w:val="9"/>
+        </w:numPr>
+        <w:spacing w:after="60"/>
+      </w:pPr>
+      <w:r>
+        <w:rPr>
+          <w:b/>
+          <w:bCs/>
+          <w:sz w:val="20"/>
+          <w:szCs w:val="20"/>
+        </w:rPr>
+        <w:t xml:space="preserve">한-중 FTA 원산지증명서(C/O) — 중국 세관(海关) 또는 CCPIT 발급 정본, HS 7608.20 기재</w:t>
+      </w:r>
+    </w:p>
+    <w:p>
+      <w:pPr>
+        <w:pStyle w:val="ListParagraph"/>
+        <w:numPr>
+          <w:ilvl w:val="0"/>
+          <w:numId w:val="9"/>
+        </w:numPr>
+        <w:spacing w:after="60"/>
+      </w:pPr>
+      <w:r>
+        <w:rPr>
+          <w:b w:val="false"/>
+          <w:bCs w:val="false"/>
+          <w:sz w:val="20"/>
+          <w:szCs w:val="20"/>
+        </w:rPr>
+        <w:t xml:space="preserve">Commercial Invoice — HS 7608.20 기재</w:t>
+      </w:r>
+    </w:p>
+    <w:p>
+      <w:pPr>
+        <w:pStyle w:val="ListParagraph"/>
+        <w:numPr>
+          <w:ilvl w:val="0"/>
+          <w:numId w:val="9"/>
+        </w:numPr>
+        <w:spacing w:after="60"/>
+      </w:pPr>
+      <w:r>
+        <w:rPr>
+          <w:b w:val="false"/>
+          <w:bCs w:val="false"/>
+          <w:sz w:val="20"/>
+          <w:szCs w:val="20"/>
+        </w:rPr>
+        <w:t xml:space="preserve">Packing List</w:t>
+      </w:r>
+    </w:p>
+    <w:p>
+      <w:pPr>
+        <w:pStyle w:val="ListParagraph"/>
+        <w:numPr>
+          <w:ilvl w:val="0"/>
+          <w:numId w:val="9"/>
+        </w:numPr>
+        <w:spacing w:after="60"/>
+      </w:pPr>
+      <w:r>
+        <w:rPr>
+          <w:b w:val="false"/>
+          <w:bCs w:val="false"/>
+          <w:sz w:val="20"/>
+          <w:szCs w:val="20"/>
+        </w:rPr>
+        <w:t xml:space="preserve">B/L</w:t>
+      </w:r>
+    </w:p>
+    <w:p>
+      <w:pPr>
+        <w:pStyle w:val="Heading1"/>
+        <w:pBdr>
+          <w:bottom w:val="single" w:color="5A9A96" w:sz="4"/>
+        </w:pBdr>
+        <w:spacing w:after="140" w:before="340"/>
+      </w:pPr>
+      <w:r>
+        <w:rPr>
+          <w:b/>
+          <w:bCs/>
+          <w:color w:val="2E5878"/>
+          <w:sz w:val="26"/>
+          <w:szCs w:val="26"/>
+        </w:rPr>
+        <w:t xml:space="preserve">7. 미확인 항목 (협의 시 확인 필요)</w:t>
+      </w:r>
+    </w:p>
+    <w:p>
+      <w:pPr>
+        <w:pStyle w:val="ListParagraph"/>
+        <w:numPr>
+          <w:ilvl w:val="0"/>
+          <w:numId w:val="10"/>
+        </w:numPr>
+        <w:spacing w:after="60"/>
+      </w:pPr>
+      <w:r>
+        <w:rPr>
+          <w:sz w:val="20"/>
+          <w:szCs w:val="20"/>
+        </w:rPr>
+        <w:t xml:space="preserve">실제 생산 공정 (냉간인발 / 열간압출 / 단조)</w:t>
+      </w:r>
+    </w:p>
+    <w:p>
+      <w:pPr>
+        <w:pStyle w:val="ListParagraph"/>
+        <w:numPr>
+          <w:ilvl w:val="0"/>
+          <w:numId w:val="10"/>
+        </w:numPr>
+        <w:spacing w:after="60"/>
+      </w:pPr>
+      <w:r>
+        <w:rPr>
+          <w:sz w:val="20"/>
+          <w:szCs w:val="20"/>
+        </w:rPr>
+        <w:t xml:space="preserve">φ450·φ460 생산 주체 (자사 / 협력사) — C/O 발급 주체와 직결</w:t>
+      </w:r>
+    </w:p>
+    <w:p>
+      <w:pPr>
+        <w:pStyle w:val="ListParagraph"/>
+        <w:numPr>
+          <w:ilvl w:val="0"/>
+          <w:numId w:val="10"/>
+        </w:numPr>
+        <w:spacing w:after="60"/>
+      </w:pPr>
+      <w:r>
+        <w:rPr>
+          <w:sz w:val="20"/>
+          <w:szCs w:val="20"/>
+        </w:rPr>
+        <w:t xml:space="preserve">MTC 적용 제품 표준 — GB/T 6893(냉간인발) / GB/T 4437.1(열간압출) 중 무엇인지 = 실제 공정 확인의 핵심</w:t>
+      </w:r>
+    </w:p>
+    <w:p>
+      <w:pPr>
+        <w:pStyle w:val="ListParagraph"/>
+        <w:numPr>
+          <w:ilvl w:val="0"/>
+          <w:numId w:val="10"/>
+        </w:numPr>
+        <w:spacing w:after="60"/>
+      </w:pPr>
+      <w:r>
+        <w:rPr>
+          <w:sz w:val="20"/>
+          <w:szCs w:val="20"/>
+        </w:rPr>
+        <w:t xml:space="preserve">규격별 MOQ</w:t>
+      </w:r>
+    </w:p>
+    <w:p>
+      <w:pPr>
+        <w:pStyle w:val="ListParagraph"/>
+        <w:numPr>
+          <w:ilvl w:val="0"/>
+          <w:numId w:val="10"/>
+        </w:numPr>
+        <w:spacing w:after="60"/>
+      </w:pPr>
+      <w:r>
+        <w:rPr>
+          <w:sz w:val="20"/>
+          <w:szCs w:val="20"/>
+        </w:rPr>
+        <w:t xml:space="preserve">재고 보유 여부</w:t>
+      </w:r>
+    </w:p>
+    <w:p>
+      <w:pPr>
+        <w:pStyle w:val="ListParagraph"/>
+        <w:numPr>
+          <w:ilvl w:val="0"/>
+          <w:numId w:val="10"/>
+        </w:numPr>
+        <w:spacing w:after="60"/>
+      </w:pPr>
+      <w:r>
+        <w:rPr>
+          <w:sz w:val="20"/>
+          <w:szCs w:val="20"/>
+        </w:rPr>
+        <w:t xml:space="preserve">공장 방문 가능 여부</w:t>
+      </w:r>
+    </w:p>
+    <w:p>
+      <w:pPr>
+        <w:pStyle w:val="ListParagraph"/>
+        <w:numPr>
+          <w:ilvl w:val="0"/>
+          <w:numId w:val="10"/>
+        </w:numPr>
+        <w:spacing w:after="60"/>
+      </w:pPr>
+      <w:r>
+        <w:rPr>
+          <w:sz w:val="20"/>
+          <w:szCs w:val="20"/>
+        </w:rPr>
+        <w:t xml:space="preserve">Fuchengtai 대비 단가 차이 사유</w:t>
+      </w:r>
+    </w:p>
+    <w:p>
+      <w:pPr>
+        <w:pStyle w:val="ListParagraph"/>
+        <w:numPr>
+          <w:ilvl w:val="0"/>
+          <w:numId w:val="10"/>
+        </w:numPr>
+        <w:spacing w:after="60"/>
+      </w:pPr>
+      <w:r>
+        <w:rPr>
+          <w:sz w:val="20"/>
+          <w:szCs w:val="20"/>
+        </w:rPr>
+        <w:t xml:space="preserve">Group A·B (18개 품목, L2,000mm) 대응 가능 여부 및 견적 — 미논의</w:t>
+      </w:r>
+    </w:p>
+    <w:p>
+      <w:pPr>
+        <w:pStyle w:val="Heading1"/>
+        <w:pBdr>
+          <w:bottom w:val="single" w:color="5A9A96" w:sz="4"/>
+        </w:pBdr>
+        <w:spacing w:after="140" w:before="340"/>
+      </w:pPr>
+      <w:r>
+        <w:rPr>
+          <w:b/>
+          <w:bCs/>
+          <w:color w:val="2E5878"/>
+          <w:sz w:val="26"/>
+          <w:szCs w:val="26"/>
+        </w:rPr>
+        <w:t xml:space="preserve">8. 기술 검토 (DOHO 자체 판단)</w:t>
+      </w:r>
+    </w:p>
+    <w:p>
+      <w:pPr>
+        <w:pStyle w:val="ListParagraph"/>
+        <w:numPr>
+          <w:ilvl w:val="0"/>
+          <w:numId w:val="11"/>
+        </w:numPr>
+        <w:spacing w:after="60"/>
+      </w:pPr>
+      <w:r>
+        <w:rPr>
+          <w:sz w:val="20"/>
+          <w:szCs w:val="20"/>
+        </w:rPr>
+        <w:t xml:space="preserve">Botong 보유 최대 프레스는 2,300톤급 → 빌렛 직경 추정 230~254mm 이하. 당사 규격 φ450·φ460은 약 2배로 자사 압출기 생산 불가로 추정.</w:t>
+      </w:r>
+    </w:p>
+    <w:p>
+      <w:pPr>
+        <w:pStyle w:val="ListParagraph"/>
+        <w:numPr>
+          <w:ilvl w:val="0"/>
+          <w:numId w:val="11"/>
+        </w:numPr>
+        <w:spacing w:after="60"/>
+      </w:pPr>
+      <w:r>
+        <w:rPr>
+          <w:sz w:val="20"/>
+          <w:szCs w:val="20"/>
+        </w:rPr>
+        <w:t xml:space="preserve">따라서 φ450/φ460 견적가는 외부 조달가일 가능성이 있음.</w:t>
+      </w:r>
+    </w:p>
+    <w:p>
+      <w:pPr>
+        <w:pStyle w:val="ListParagraph"/>
+        <w:numPr>
+          <w:ilvl w:val="0"/>
+          <w:numId w:val="11"/>
+        </w:numPr>
+        <w:spacing w:after="60"/>
+      </w:pPr>
+      <w:r>
+        <w:rPr>
+          <w:sz w:val="20"/>
+          <w:szCs w:val="20"/>
+        </w:rPr>
+        <w:t xml:space="preserve">방문/협의 시 확인: 보유 프레스 실물 톤수와 컨테이너 직경, 당사 규격의 실제 생산 공장.</w:t>
+      </w:r>
+    </w:p>
+    <w:p>
+      <w:pPr>
+        <w:pStyle w:val="ListParagraph"/>
+        <w:numPr>
+          <w:ilvl w:val="0"/>
+          <w:numId w:val="11"/>
+        </w:numPr>
+        <w:spacing w:after="60"/>
+      </w:pPr>
+      <w:r>
+        <w:rPr>
+          <w:sz w:val="20"/>
+          <w:szCs w:val="20"/>
+        </w:rPr>
+        <w:t xml:space="preserve">외주 생산으로 확인될 경우: MTC 발행 주체, C/O 발급 가능 여부(HS 7608.20), 품질 책임 소재를 서면으로 정리할 것.</w:t>
+      </w:r>
+    </w:p>
+    <w:p>
+      <w:pPr>
+        <w:pStyle w:val="ListParagraph"/>
+        <w:numPr>
+          <w:ilvl w:val="0"/>
+          <w:numId w:val="11"/>
         </w:numPr>
         <w:spacing w:after="60"/>
       </w:pPr>
@@ -8309,6 +9753,30 @@
     </w:lvl>
   </w:abstractNum>
   <w:abstractNum w:abstractNumId="9" w15:restartNumberingAfterBreak="0">
+    <w:multiLevelType w:val="hybridMultilevel"/>
+    <w:lvl w:ilvl="0" w15:tentative="1">
+      <w:start w:val="1"/>
+      <w:numFmt w:val="decimal"/>
+      <w:lvlText w:val="%1."/>
+      <w:lvlJc w:val="start"/>
+      <w:pPr>
+        <w:ind w:left="720" w:hanging="360"/>
+      </w:pPr>
+    </w:lvl>
+  </w:abstractNum>
+  <w:abstractNum w:abstractNumId="10" w15:restartNumberingAfterBreak="0">
+    <w:multiLevelType w:val="hybridMultilevel"/>
+    <w:lvl w:ilvl="0" w15:tentative="1">
+      <w:start w:val="1"/>
+      <w:numFmt w:val="decimal"/>
+      <w:lvlText w:val="%1."/>
+      <w:lvlJc w:val="start"/>
+      <w:pPr>
+        <w:ind w:left="720" w:hanging="360"/>
+      </w:pPr>
+    </w:lvl>
+  </w:abstractNum>
+  <w:abstractNum w:abstractNumId="11" w15:restartNumberingAfterBreak="0">
     <w:multiLevelType w:val="hybridMultilevel"/>
     <w:lvl w:ilvl="0" w15:tentative="1">
       <w:start w:val="1"/>
@@ -8357,18 +9825,30 @@
     </w:lvlOverride>
   </w:num>
   <w:num w:numId="7">
+    <w:abstractNumId w:val="10"/>
+    <w:lvlOverride w:ilvl="0">
+      <w:startOverride w:val="1"/>
+    </w:lvlOverride>
+  </w:num>
+  <w:num w:numId="8">
+    <w:abstractNumId w:val="11"/>
+    <w:lvlOverride w:ilvl="0">
+      <w:startOverride w:val="1"/>
+    </w:lvlOverride>
+  </w:num>
+  <w:num w:numId="9">
     <w:abstractNumId w:val="2"/>
     <w:lvlOverride w:ilvl="0">
       <w:startOverride w:val="1"/>
     </w:lvlOverride>
   </w:num>
-  <w:num w:numId="8">
+  <w:num w:numId="10">
     <w:abstractNumId w:val="4"/>
     <w:lvlOverride w:ilvl="0">
       <w:startOverride w:val="1"/>
     </w:lvlOverride>
   </w:num>
-  <w:num w:numId="9">
+  <w:num w:numId="11">
     <w:abstractNumId w:val="5"/>
     <w:lvlOverride w:ilvl="0">
       <w:startOverride w:val="1"/>

</xml_diff>